<commit_message>
FN2: audit fixes (sl5 spoiler, quantity speech, one-solution and same-direction-graph items, fraction reduction, CheckIt graph notes, cases reflow), audit md, README row
Co-Authored-By: Claude Opus 5.5 <noreply@anthropic.com>
Claude-Session: https://claude.ai/code/session_013Y8PfETWcMLvmUEpCdE8Wq
</commit_message>
<xml_diff>
--- a/support-materials/FN2/FN2_worked_examples.docx
+++ b/support-materials/FN2/FN2_worked_examples.docx
@@ -1438,7 +1438,7 @@
       <w:r>
         <w:drawing>
           <wp:inline distT="0" distB="0" distL="0" distR="0">
-            <wp:extent cx="3000375" cy="2476500"/>
+            <wp:extent cx="2981325" cy="2476500"/>
             <wp:effectExtent t="0" r="0" b="0" l="0"/>
             <wp:docPr id="1" name="rg1" descr="The graph of g, made of three straight segments. Plotted data: A graph of g on the interval from x = −5 to x = 4, drawn on a grid with lines every 1 unit. It is made of three straight segments: from (−5, −1) up to (−3, 3), then down to (1, −1), then up to (4, 5). The ends and corners are marked with dots." title="The graph of g, made of three straight segments"/>
             <wp:cNvGraphicFramePr>
@@ -1463,7 +1463,7 @@
                   <pic:spPr bwMode="auto">
                     <a:xfrm>
                       <a:off x="0" y="0"/>
-                      <a:ext cx="3000375" cy="2476500"/>
+                      <a:ext cx="2981325" cy="2476500"/>
                     </a:xfrm>
                     <a:prstGeom prst="rect">
                       <a:avLst/>
@@ -1727,7 +1727,7 @@
       <w:r>
         <w:drawing>
           <wp:inline distT="0" distB="0" distL="0" distR="0">
-            <wp:extent cx="3305175" cy="2476500"/>
+            <wp:extent cx="3286125" cy="2476500"/>
             <wp:effectExtent t="0" r="0" b="0" l="0"/>
             <wp:docPr id="1" name="rg2" descr="The graph of g, made of three straight segments. Plotted data: A graph of g on the interval from x = −4 to x = 5, drawn on a grid with lines every 1 unit. It is made of three straight segments: from (−4, 4) down to (−1, −2), then up to (3, 2), then down to (5, 0). The ends and corners are marked with dots." title="The graph of g, made of three straight segments"/>
             <wp:cNvGraphicFramePr>
@@ -1752,7 +1752,7 @@
                   <pic:spPr bwMode="auto">
                     <a:xfrm>
                       <a:off x="0" y="0"/>
-                      <a:ext cx="3305175" cy="2476500"/>
+                      <a:ext cx="3286125" cy="2476500"/>
                     </a:xfrm>
                     <a:prstGeom prst="rect">
                       <a:avLst/>
@@ -1966,7 +1966,7 @@
       <w:r>
         <w:drawing>
           <wp:inline distT="0" distB="0" distL="0" distR="0">
-            <wp:extent cx="3000375" cy="2476500"/>
+            <wp:extent cx="2981325" cy="2476500"/>
             <wp:effectExtent t="0" r="0" b="0" l="0"/>
             <wp:docPr id="1" name="rg3" descr="The graph of g, made of three straight segments. Plotted data: A graph of g on the interval from x = −5 to x = 4, drawn on a grid with lines every 1 unit. It is made of three straight segments: from (−5, −1) up to (−3, 3), then down to (1, −1), then up to (4, 5). The ends and corners are marked with dots." title="The graph of g, made of three straight segments"/>
             <wp:cNvGraphicFramePr>
@@ -1991,7 +1991,7 @@
                   <pic:spPr bwMode="auto">
                     <a:xfrm>
                       <a:off x="0" y="0"/>
-                      <a:ext cx="3000375" cy="2476500"/>
+                      <a:ext cx="2981325" cy="2476500"/>
                     </a:xfrm>
                     <a:prstGeom prst="rect">
                       <a:avLst/>
@@ -2071,7 +2071,7 @@
         <w:t xml:space="preserve">B.  </w:t>
       </w:r>
       <w:r>
-        <w:t xml:space="preserve">x = −2 only, the one on a grid line</w:t>
+        <w:t xml:space="preserve">x = −2 only, the crossing at a whole number</w:t>
       </w:r>
     </w:p>
     <w:p>
@@ -2190,7 +2190,7 @@
         <w:t xml:space="preserve">x=2.5</w:t>
       </w:r>
       <w:r>
-        <w:t xml:space="preserve">. "−2 only" keeps just the crossing on a grid line; leaving out −2 misses the middle segment; and −4 and 2 round the halves to whole numbers. </w:t>
+        <w:t xml:space="preserve">. "−2 only" keeps just the crossing at a whole number; leaving out −2 misses the middle segment; and −4 and 2 round the halves down. </w:t>
       </w:r>
       <w:r>
         <w:rPr>
@@ -2257,7 +2257,7 @@
       <w:r>
         <w:drawing>
           <wp:inline distT="0" distB="0" distL="0" distR="0">
-            <wp:extent cx="3305175" cy="2476500"/>
+            <wp:extent cx="3286125" cy="2476500"/>
             <wp:effectExtent t="0" r="0" b="0" l="0"/>
             <wp:docPr id="1" name="rg4" descr="The graph of g, made of three straight segments. Plotted data: A graph of g on the interval from x = −4 to x = 5, drawn on a grid with lines every 1 unit. It is made of three straight segments: from (−4, 4) down to (−1, −2), then up to (3, 2), then down to (5, 0). The ends and corners are marked with dots." title="The graph of g, made of three straight segments"/>
             <wp:cNvGraphicFramePr>
@@ -2282,7 +2282,7 @@
                   <pic:spPr bwMode="auto">
                     <a:xfrm>
                       <a:off x="0" y="0"/>
-                      <a:ext cx="3305175" cy="2476500"/>
+                      <a:ext cx="3286125" cy="2476500"/>
                     </a:xfrm>
                     <a:prstGeom prst="rect">
                       <a:avLst/>
@@ -2545,1513 +2545,7 @@
         <w:pageBreakBefore/>
       </w:pPr>
       <w:r>
-        <w:t xml:space="preserve">Example 9: Which Way?</w:t>
-      </w:r>
-    </w:p>
-    <w:p>
-      <w:pPr>
-        <w:spacing w:after="200" w:before="200"/>
-        <w:jc w:val="center"/>
-      </w:pPr>
-      <w:r>
-        <w:rPr>
-          <w:i/>
-          <w:iCs/>
-          <w:sz w:val="40"/>
-          <w:szCs w:val="40"/>
-        </w:rPr>
-        <w:t xml:space="preserve">g(x)</w:t>
-      </w:r>
-    </w:p>
-    <w:p>
-      <w:pPr>
-        <w:pStyle w:val="Heading3"/>
-        <w:keepNext/>
-      </w:pPr>
-      <w:r>
-        <w:t xml:space="preserve">Question</w:t>
-      </w:r>
-    </w:p>
-    <w:p>
-      <w:pPr>
-        <w:spacing w:after="120" w:before="80" w:line="300"/>
-      </w:pPr>
-      <w:r>
-        <w:t xml:space="preserve">For a function g, which question asks you to find x-values?</w:t>
-      </w:r>
-    </w:p>
-    <w:p>
-      <w:pPr>
-        <w:spacing w:after="40" w:before="20"/>
-        <w:ind w:left="360"/>
-      </w:pPr>
-      <w:r>
-        <w:rPr>
-          <w:b/>
-          <w:bCs/>
-        </w:rPr>
-        <w:t xml:space="preserve">A.  </w:t>
-      </w:r>
-      <w:r>
-        <w:t xml:space="preserve">Find g(4).</w:t>
-      </w:r>
-    </w:p>
-    <w:p>
-      <w:pPr>
-        <w:spacing w:after="40" w:before="20"/>
-        <w:ind w:left="360"/>
-      </w:pPr>
-      <w:r>
-        <w:rPr>
-          <w:b/>
-          <w:bCs/>
-        </w:rPr>
-        <w:t xml:space="preserve">B.  </w:t>
-      </w:r>
-      <w:r>
-        <w:t xml:space="preserve">What is the output when the input is 4?</w:t>
-      </w:r>
-    </w:p>
-    <w:p>
-      <w:pPr>
-        <w:spacing w:after="40" w:before="20"/>
-        <w:ind w:left="360"/>
-      </w:pPr>
-      <w:r>
-        <w:rPr>
-          <w:b/>
-          <w:bCs/>
-        </w:rPr>
-        <w:t xml:space="preserve">C.  </w:t>
-      </w:r>
-      <w:r>
-        <w:t xml:space="preserve">For which x does g(x) = 4?</w:t>
-      </w:r>
-    </w:p>
-    <w:p>
-      <w:pPr>
-        <w:spacing w:after="40" w:before="20"/>
-        <w:ind w:left="360"/>
-      </w:pPr>
-      <w:r>
-        <w:rPr>
-          <w:b/>
-          <w:bCs/>
-        </w:rPr>
-        <w:t xml:space="preserve">D.  </w:t>
-      </w:r>
-      <w:r>
-        <w:t xml:space="preserve">Evaluate g at x = 4.</w:t>
-      </w:r>
-    </w:p>
-    <w:p>
-      <w:pPr>
-        <w:pStyle w:val="Heading3"/>
-        <w:keepNext/>
-      </w:pPr>
-      <w:r>
-        <w:t xml:space="preserve">Answer and reasoning</w:t>
-      </w:r>
-    </w:p>
-    <w:p>
-      <w:pPr>
-        <w:spacing w:after="120" w:before="80" w:line="300"/>
-      </w:pPr>
-      <w:r>
-        <w:t xml:space="preserve">In </w:t>
-      </w:r>
-      <w:r>
-        <w:rPr>
-          <w:i/>
-          <w:iCs/>
-        </w:rPr>
-        <w:t xml:space="preserve">g(x)=4</w:t>
-      </w:r>
-      <w:r>
-        <w:t xml:space="preserve">, the 4 is an output, and the question asks which inputs produce it, so the answer is </w:t>
-      </w:r>
-      <w:r>
-        <w:rPr>
-          <w:i/>
-          <w:iCs/>
-        </w:rPr>
-        <w:t xml:space="preserve">x</w:t>
-      </w:r>
-      <w:r>
-        <w:t xml:space="preserve">-values. The other three all say the same thing in different words: put in 4 and find the output, </w:t>
-      </w:r>
-      <w:r>
-        <w:rPr>
-          <w:i/>
-          <w:iCs/>
-        </w:rPr>
-        <w:t xml:space="preserve">g(4)</w:t>
-      </w:r>
-      <w:r>
-        <w:t xml:space="preserve">. </w:t>
-      </w:r>
-      <w:r>
-        <w:rPr>
-          <w:b/>
-          <w:bCs/>
-        </w:rPr>
-        <w:t xml:space="preserve">For which x does g(x) = 4?</w:t>
-      </w:r>
-    </w:p>
-    <w:p>
-      <w:pPr>
-        <w:pStyle w:val="Heading2"/>
-        <w:pageBreakBefore/>
-      </w:pPr>
-      <w:r>
-        <w:t xml:space="preserve">Example 10: What It Means</w:t>
-      </w:r>
-    </w:p>
-    <w:p>
-      <w:pPr>
-        <w:spacing w:after="200" w:before="200"/>
-        <w:jc w:val="center"/>
-      </w:pPr>
-      <w:r>
-        <w:rPr>
-          <w:i/>
-          <w:iCs/>
-          <w:sz w:val="40"/>
-          <w:szCs w:val="40"/>
-        </w:rPr>
-        <w:t xml:space="preserve">C(10)=150</w:t>
-      </w:r>
-    </w:p>
-    <w:p>
-      <w:pPr>
-        <w:pStyle w:val="Heading3"/>
-        <w:keepNext/>
-      </w:pPr>
-      <w:r>
-        <w:t xml:space="preserve">Question</w:t>
-      </w:r>
-    </w:p>
-    <w:p>
-      <w:pPr>
-        <w:spacing w:after="120" w:before="80" w:line="300"/>
-      </w:pPr>
-      <w:r>
-        <w:t xml:space="preserve">C(m) is the temperature of a cup of coffee, in degrees Fahrenheit, m minutes after it is poured. What does C(10) = 150 mean?</w:t>
-      </w:r>
-    </w:p>
-    <w:p>
-      <w:pPr>
-        <w:spacing w:after="40" w:before="20"/>
-        <w:ind w:left="360"/>
-      </w:pPr>
-      <w:r>
-        <w:rPr>
-          <w:b/>
-          <w:bCs/>
-        </w:rPr>
-        <w:t xml:space="preserve">A.  </w:t>
-      </w:r>
-      <w:r>
-        <w:t xml:space="preserve">10 minutes after it is poured, the coffee is 150°F.</w:t>
-      </w:r>
-    </w:p>
-    <w:p>
-      <w:pPr>
-        <w:spacing w:after="40" w:before="20"/>
-        <w:ind w:left="360"/>
-      </w:pPr>
-      <w:r>
-        <w:rPr>
-          <w:b/>
-          <w:bCs/>
-        </w:rPr>
-        <w:t xml:space="preserve">B.  </w:t>
-      </w:r>
-      <w:r>
-        <w:t xml:space="preserve">150 minutes after it is poured, the coffee is 10°F.</w:t>
-      </w:r>
-    </w:p>
-    <w:p>
-      <w:pPr>
-        <w:spacing w:after="40" w:before="20"/>
-        <w:ind w:left="360"/>
-      </w:pPr>
-      <w:r>
-        <w:rPr>
-          <w:b/>
-          <w:bCs/>
-        </w:rPr>
-        <w:t xml:space="preserve">C.  </w:t>
-      </w:r>
-      <w:r>
-        <w:t xml:space="preserve">The coffee cools by 150 degrees in 10 minutes.</w:t>
-      </w:r>
-    </w:p>
-    <w:p>
-      <w:pPr>
-        <w:spacing w:after="40" w:before="20"/>
-        <w:ind w:left="360"/>
-      </w:pPr>
-      <w:r>
-        <w:rPr>
-          <w:b/>
-          <w:bCs/>
-        </w:rPr>
-        <w:t xml:space="preserve">D.  </w:t>
-      </w:r>
-      <w:r>
-        <w:t xml:space="preserve">C times 10 equals 150, so C is 15.</w:t>
-      </w:r>
-    </w:p>
-    <w:p>
-      <w:pPr>
-        <w:pStyle w:val="Heading3"/>
-        <w:keepNext/>
-      </w:pPr>
-      <w:r>
-        <w:t xml:space="preserve">Answer and reasoning</w:t>
-      </w:r>
-    </w:p>
-    <w:p>
-      <w:pPr>
-        <w:spacing w:after="120" w:before="80" w:line="300"/>
-      </w:pPr>
-      <w:r>
-        <w:t xml:space="preserve">The input, in the parentheses, is the time: 10 minutes. The output is the temperature: 150°F. Swapping them reads the notation backwards; "cools by 150" turns an output into a change, which the notation does not say; and </w:t>
-      </w:r>
-      <w:r>
-        <w:rPr>
-          <w:i/>
-          <w:iCs/>
-        </w:rPr>
-        <w:t xml:space="preserve">C(10)</w:t>
-      </w:r>
-      <w:r>
-        <w:t xml:space="preserve"> is not multiplication: </w:t>
-      </w:r>
-      <w:r>
-        <w:rPr>
-          <w:i/>
-          <w:iCs/>
-        </w:rPr>
-        <w:t xml:space="preserve">C</w:t>
-      </w:r>
-      <w:r>
-        <w:t xml:space="preserve"> is the name of the function. </w:t>
-      </w:r>
-      <w:r>
-        <w:rPr>
-          <w:b/>
-          <w:bCs/>
-        </w:rPr>
-        <w:t xml:space="preserve">10 minutes after it is poured, the coffee is 150°F.</w:t>
-      </w:r>
-    </w:p>
-    <w:p>
-      <w:pPr>
-        <w:pStyle w:val="Heading2"/>
-        <w:pageBreakBefore/>
-      </w:pPr>
-      <w:r>
-        <w:t xml:space="preserve">Example 11: On the Graph</w:t>
-      </w:r>
-    </w:p>
-    <w:p>
-      <w:pPr>
-        <w:spacing w:after="200" w:before="200"/>
-        <w:jc w:val="center"/>
-      </w:pPr>
-      <w:r>
-        <w:rPr>
-          <w:i/>
-          <w:iCs/>
-          <w:sz w:val="40"/>
-          <w:szCs w:val="40"/>
-        </w:rPr>
-        <w:t xml:space="preserve">h(−2)=5</w:t>
-      </w:r>
-    </w:p>
-    <w:p>
-      <w:pPr>
-        <w:pStyle w:val="Heading3"/>
-        <w:keepNext/>
-      </w:pPr>
-      <w:r>
-        <w:t xml:space="preserve">Question</w:t>
-      </w:r>
-    </w:p>
-    <w:p>
-      <w:pPr>
-        <w:spacing w:after="120" w:before="80" w:line="300"/>
-      </w:pPr>
-      <w:r>
-        <w:t xml:space="preserve">Which point must be on the graph of h?</w:t>
-      </w:r>
-    </w:p>
-    <w:p>
-      <w:pPr>
-        <w:spacing w:after="40" w:before="20"/>
-        <w:ind w:left="360"/>
-      </w:pPr>
-      <w:r>
-        <w:rPr>
-          <w:b/>
-          <w:bCs/>
-        </w:rPr>
-        <w:t xml:space="preserve">A.  </w:t>
-      </w:r>
-      <w:r>
-        <w:t xml:space="preserve">(5, −2)</w:t>
-      </w:r>
-    </w:p>
-    <w:p>
-      <w:pPr>
-        <w:spacing w:after="40" w:before="20"/>
-        <w:ind w:left="360"/>
-      </w:pPr>
-      <w:r>
-        <w:rPr>
-          <w:b/>
-          <w:bCs/>
-        </w:rPr>
-        <w:t xml:space="preserve">B.  </w:t>
-      </w:r>
-      <w:r>
-        <w:t xml:space="preserve">(−2, −5)</w:t>
-      </w:r>
-    </w:p>
-    <w:p>
-      <w:pPr>
-        <w:spacing w:after="40" w:before="20"/>
-        <w:ind w:left="360"/>
-      </w:pPr>
-      <w:r>
-        <w:rPr>
-          <w:b/>
-          <w:bCs/>
-        </w:rPr>
-        <w:t xml:space="preserve">C.  </w:t>
-      </w:r>
-      <w:r>
-        <w:t xml:space="preserve">(0, 5)</w:t>
-      </w:r>
-    </w:p>
-    <w:p>
-      <w:pPr>
-        <w:spacing w:after="40" w:before="20"/>
-        <w:ind w:left="360"/>
-      </w:pPr>
-      <w:r>
-        <w:rPr>
-          <w:b/>
-          <w:bCs/>
-        </w:rPr>
-        <w:t xml:space="preserve">D.  </w:t>
-      </w:r>
-      <w:r>
-        <w:t xml:space="preserve">(−2, 5)</w:t>
-      </w:r>
-    </w:p>
-    <w:p>
-      <w:pPr>
-        <w:pStyle w:val="Heading3"/>
-        <w:keepNext/>
-      </w:pPr>
-      <w:r>
-        <w:t xml:space="preserve">Answer and reasoning</w:t>
-      </w:r>
-    </w:p>
-    <w:p>
-      <w:pPr>
-        <w:spacing w:after="120" w:before="80" w:line="300"/>
-      </w:pPr>
-      <w:r>
-        <w:rPr>
-          <w:i/>
-          <w:iCs/>
-        </w:rPr>
-        <w:t xml:space="preserve">h(−2)=5</w:t>
-      </w:r>
-      <w:r>
-        <w:t xml:space="preserve"> says the input −2 gives the output 5, and points are written (input, output). So </w:t>
-      </w:r>
-      <w:r>
-        <w:rPr>
-          <w:i/>
-          <w:iCs/>
-        </w:rPr>
-        <w:t xml:space="preserve">(−2,5)</w:t>
-      </w:r>
-      <w:r>
-        <w:t xml:space="preserve">. </w:t>
-      </w:r>
-      <w:r>
-        <w:rPr>
-          <w:i/>
-          <w:iCs/>
-        </w:rPr>
-        <w:t xml:space="preserve">(5,−2)</w:t>
-      </w:r>
-      <w:r>
-        <w:t xml:space="preserve"> swaps input and output; </w:t>
-      </w:r>
-      <w:r>
-        <w:rPr>
-          <w:i/>
-          <w:iCs/>
-        </w:rPr>
-        <w:t xml:space="preserve">(−2,−5)</w:t>
-      </w:r>
-      <w:r>
-        <w:t xml:space="preserve"> changes the output's sign; and </w:t>
-      </w:r>
-      <w:r>
-        <w:rPr>
-          <w:i/>
-          <w:iCs/>
-        </w:rPr>
-        <w:t xml:space="preserve">(0,5)</w:t>
-      </w:r>
-      <w:r>
-        <w:t xml:space="preserve"> would mean </w:t>
-      </w:r>
-      <w:r>
-        <w:rPr>
-          <w:i/>
-          <w:iCs/>
-        </w:rPr>
-        <w:t xml:space="preserve">h(0)=5</w:t>
-      </w:r>
-      <w:r>
-        <w:t xml:space="preserve">. </w:t>
-      </w:r>
-      <w:r>
-        <w:rPr>
-          <w:b/>
-          <w:bCs/>
-          <w:i/>
-          <w:iCs/>
-        </w:rPr>
-        <w:t xml:space="preserve">(−2,5)</w:t>
-      </w:r>
-      <w:r>
-        <w:rPr>
-          <w:b/>
-          <w:bCs/>
-        </w:rPr>
-        <w:t xml:space="preserve">.</w:t>
-      </w:r>
-    </w:p>
-    <w:p>
-      <w:pPr>
-        <w:pStyle w:val="Heading2"/>
-        <w:pageBreakBefore/>
-      </w:pPr>
-      <w:r>
-        <w:t xml:space="preserve">Example 12: Back to the Input</w:t>
-      </w:r>
-    </w:p>
-    <w:p>
-      <w:pPr>
-        <w:spacing w:after="200" w:before="200"/>
-        <w:jc w:val="center"/>
-      </w:pPr>
-      <w:r>
-        <w:rPr>
-          <w:i/>
-          <w:iCs/>
-          <w:sz w:val="40"/>
-          <w:szCs w:val="40"/>
-        </w:rPr>
-        <w:t xml:space="preserve">f(x)=3x−4</w:t>
-      </w:r>
-    </w:p>
-    <w:p>
-      <w:pPr>
-        <w:pStyle w:val="Heading3"/>
-        <w:keepNext/>
-      </w:pPr>
-      <w:r>
-        <w:t xml:space="preserve">Question</w:t>
-      </w:r>
-    </w:p>
-    <w:p>
-      <w:pPr>
-        <w:spacing w:after="120" w:before="80" w:line="300"/>
-      </w:pPr>
-      <w:r>
-        <w:t xml:space="preserve">For which x does f(x) = 11?</w:t>
-      </w:r>
-    </w:p>
-    <w:p>
-      <w:pPr>
-        <w:spacing w:after="40" w:before="20"/>
-        <w:ind w:left="360"/>
-      </w:pPr>
-      <w:r>
-        <w:rPr>
-          <w:b/>
-          <w:bCs/>
-        </w:rPr>
-        <w:t xml:space="preserve">A.  </w:t>
-      </w:r>
-      <w:r>
-        <w:t xml:space="preserve">x = 29</w:t>
-      </w:r>
-    </w:p>
-    <w:p>
-      <w:pPr>
-        <w:spacing w:after="40" w:before="20"/>
-        <w:ind w:left="360"/>
-      </w:pPr>
-      <w:r>
-        <w:rPr>
-          <w:b/>
-          <w:bCs/>
-        </w:rPr>
-        <w:t xml:space="preserve">B.  </w:t>
-      </w:r>
-      <w:r>
-        <w:t xml:space="preserve">x = 5</w:t>
-      </w:r>
-    </w:p>
-    <w:p>
-      <w:pPr>
-        <w:spacing w:after="40" w:before="20"/>
-        <w:ind w:left="360"/>
-      </w:pPr>
-      <w:r>
-        <w:rPr>
-          <w:b/>
-          <w:bCs/>
-        </w:rPr>
-        <w:t xml:space="preserve">C.  </w:t>
-      </w:r>
-      <w:r>
-        <w:t xml:space="preserve">x = 7/3</w:t>
-      </w:r>
-    </w:p>
-    <w:p>
-      <w:pPr>
-        <w:spacing w:after="40" w:before="20"/>
-        <w:ind w:left="360"/>
-      </w:pPr>
-      <w:r>
-        <w:rPr>
-          <w:b/>
-          <w:bCs/>
-        </w:rPr>
-        <w:t xml:space="preserve">D.  </w:t>
-      </w:r>
-      <w:r>
-        <w:t xml:space="preserve">x = 15</w:t>
-      </w:r>
-    </w:p>
-    <w:p>
-      <w:pPr>
-        <w:pStyle w:val="Heading3"/>
-        <w:keepNext/>
-      </w:pPr>
-      <w:r>
-        <w:t xml:space="preserve">Answer and reasoning</w:t>
-      </w:r>
-    </w:p>
-    <w:p>
-      <w:pPr>
-        <w:spacing w:after="120" w:before="80" w:line="300"/>
-      </w:pPr>
-      <w:r>
-        <w:t xml:space="preserve">Set the output equal to 11 and solve for the input: </w:t>
-      </w:r>
-      <w:r>
-        <w:rPr>
-          <w:i/>
-          <w:iCs/>
-        </w:rPr>
-        <w:t xml:space="preserve">3x−4=11</w:t>
-      </w:r>
-      <w:r>
-        <w:t xml:space="preserve">, </w:t>
-      </w:r>
-      <w:r>
-        <w:rPr>
-          <w:i/>
-          <w:iCs/>
-        </w:rPr>
-        <w:t xml:space="preserve">3x=15</w:t>
-      </w:r>
-      <w:r>
-        <w:t xml:space="preserve">, </w:t>
-      </w:r>
-      <w:r>
-        <w:rPr>
-          <w:i/>
-          <w:iCs/>
-        </w:rPr>
-        <w:t xml:space="preserve">x=5</w:t>
-      </w:r>
-      <w:r>
-        <w:t xml:space="preserve">. Check: </w:t>
-      </w:r>
-      <w:r>
-        <w:rPr>
-          <w:i/>
-          <w:iCs/>
-        </w:rPr>
-        <w:t xml:space="preserve">f(5)=15−4=11</w:t>
-      </w:r>
-      <w:r>
-        <w:t xml:space="preserve">. 29 is </w:t>
-      </w:r>
-      <w:r>
-        <w:rPr>
-          <w:i/>
-          <w:iCs/>
-        </w:rPr>
-        <w:t xml:space="preserve">f(11)</w:t>
-      </w:r>
-      <w:r>
-        <w:t xml:space="preserve">, the output for input 11, the opposite question; </w:t>
-      </w:r>
-      <w:r>
-        <w:rPr>
-          <w:i/>
-          <w:iCs/>
-        </w:rPr>
-        <w:t xml:space="preserve">7/3</w:t>
-      </w:r>
-      <w:r>
-        <w:t xml:space="preserve"> subtracts the 4 instead of adding it; and 15 stops before dividing by 3. </w:t>
-      </w:r>
-      <w:r>
-        <w:rPr>
-          <w:b/>
-          <w:bCs/>
-          <w:i/>
-          <w:iCs/>
-        </w:rPr>
-        <w:t xml:space="preserve">x=5</w:t>
-      </w:r>
-      <w:r>
-        <w:rPr>
-          <w:b/>
-          <w:bCs/>
-        </w:rPr>
-        <w:t xml:space="preserve">.</w:t>
-      </w:r>
-    </w:p>
-    <w:p>
-      <w:pPr>
-        <w:pStyle w:val="Heading2"/>
-        <w:pageBreakBefore/>
-      </w:pPr>
-      <w:r>
-        <w:t xml:space="preserve">Example 13: Slip 1</w:t>
-      </w:r>
-    </w:p>
-    <w:p>
-      <w:pPr>
-        <w:spacing w:after="40" w:before="200"/>
-        <w:jc w:val="center"/>
-      </w:pPr>
-      <w:r>
-        <w:rPr>
-          <w:i/>
-          <w:iCs/>
-          <w:sz w:val="40"/>
-          <w:szCs w:val="40"/>
-        </w:rPr>
-        <w:t xml:space="preserve">m(x)=</w:t>
-      </w:r>
-    </w:p>
-    <w:p>
-      <w:pPr>
-        <w:spacing w:after="40" w:before="40"/>
-        <w:jc w:val="center"/>
-      </w:pPr>
-      <w:r>
-        <w:rPr>
-          <w:i/>
-          <w:iCs/>
-          <w:sz w:val="36"/>
-          <w:szCs w:val="36"/>
-        </w:rPr>
-        <w:t xml:space="preserve">3x</w:t>
-      </w:r>
-      <w:r>
-        <w:rPr>
-          <w:i/>
-          <w:iCs/>
-          <w:sz w:val="36"/>
-          <w:szCs w:val="36"/>
-          <w:vertAlign w:val="superscript"/>
-        </w:rPr>
-        <w:t xml:space="preserve">2</w:t>
-      </w:r>
-      <w:r>
-        <w:rPr>
-          <w:i/>
-          <w:iCs/>
-          <w:sz w:val="36"/>
-          <w:szCs w:val="36"/>
-        </w:rPr>
-        <w:t xml:space="preserve">+1</w:t>
-      </w:r>
-      <w:r>
-        <w:rPr>
-          <w:sz w:val="36"/>
-          <w:szCs w:val="36"/>
-        </w:rPr>
-        <w:t xml:space="preserve">,   if   </w:t>
-      </w:r>
-      <w:r>
-        <w:rPr>
-          <w:i/>
-          <w:iCs/>
-          <w:sz w:val="36"/>
-          <w:szCs w:val="36"/>
-        </w:rPr>
-        <w:t xml:space="preserve">−5&lt; x&lt; 0</w:t>
-      </w:r>
-    </w:p>
-    <w:p>
-      <w:pPr>
-        <w:spacing w:after="200" w:before="40"/>
-        <w:jc w:val="center"/>
-      </w:pPr>
-      <w:r>
-        <w:rPr>
-          <w:i/>
-          <w:iCs/>
-          <w:sz w:val="36"/>
-          <w:szCs w:val="36"/>
-        </w:rPr>
-        <w:t xml:space="preserve">√(x</w:t>
-      </w:r>
-      <w:r>
-        <w:rPr>
-          <w:i/>
-          <w:iCs/>
-          <w:sz w:val="36"/>
-          <w:szCs w:val="36"/>
-          <w:vertAlign w:val="superscript"/>
-        </w:rPr>
-        <w:t xml:space="preserve">2</w:t>
-      </w:r>
-      <w:r>
-        <w:rPr>
-          <w:i/>
-          <w:iCs/>
-          <w:sz w:val="36"/>
-          <w:szCs w:val="36"/>
-        </w:rPr>
-        <w:t xml:space="preserve">+5)</w:t>
-      </w:r>
-      <w:r>
-        <w:rPr>
-          <w:sz w:val="36"/>
-          <w:szCs w:val="36"/>
-        </w:rPr>
-        <w:t xml:space="preserve">,   if   </w:t>
-      </w:r>
-      <w:r>
-        <w:rPr>
-          <w:i/>
-          <w:iCs/>
-          <w:sz w:val="36"/>
-          <w:szCs w:val="36"/>
-        </w:rPr>
-        <w:t xml:space="preserve">0≤ x&lt; 5</w:t>
-      </w:r>
-    </w:p>
-    <w:p>
-      <w:pPr>
-        <w:pStyle w:val="Heading3"/>
-        <w:keepNext/>
-      </w:pPr>
-      <w:r>
-        <w:t xml:space="preserve">Question</w:t>
-      </w:r>
-    </w:p>
-    <w:p>
-      <w:pPr>
-        <w:spacing w:after="120" w:before="80" w:line="300"/>
-      </w:pPr>
-      <w:r>
-        <w:t xml:space="preserve">A student found m(0) = 3(0)² + 1 = 1. What is the mistake, if any?</w:t>
-      </w:r>
-    </w:p>
-    <w:p>
-      <w:pPr>
-        <w:spacing w:after="40" w:before="20"/>
-        <w:ind w:left="360"/>
-      </w:pPr>
-      <w:r>
-        <w:rPr>
-          <w:b/>
-          <w:bCs/>
-        </w:rPr>
-        <w:t xml:space="preserve">A.  </w:t>
-      </w:r>
-      <w:r>
-        <w:t xml:space="preserve">There is no mistake.</w:t>
-      </w:r>
-    </w:p>
-    <w:p>
-      <w:pPr>
-        <w:spacing w:after="40" w:before="20"/>
-        <w:ind w:left="360"/>
-      </w:pPr>
-      <w:r>
-        <w:rPr>
-          <w:b/>
-          <w:bCs/>
-        </w:rPr>
-        <w:t xml:space="preserve">B.  </w:t>
-      </w:r>
-      <w:r>
-        <w:t xml:space="preserve">0 belongs to the piece with 0 ≤ x, so m(0) = √5.</w:t>
-      </w:r>
-    </w:p>
-    <w:p>
-      <w:pPr>
-        <w:spacing w:after="40" w:before="20"/>
-        <w:ind w:left="360"/>
-      </w:pPr>
-      <w:r>
-        <w:rPr>
-          <w:b/>
-          <w:bCs/>
-        </w:rPr>
-        <w:t xml:space="preserve">C.  </w:t>
-      </w:r>
-      <w:r>
-        <w:t xml:space="preserve">m(0) is undefined, since 0 is where the pieces meet.</w:t>
-      </w:r>
-    </w:p>
-    <w:p>
-      <w:pPr>
-        <w:spacing w:after="40" w:before="20"/>
-        <w:ind w:left="360"/>
-      </w:pPr>
-      <w:r>
-        <w:rPr>
-          <w:b/>
-          <w:bCs/>
-        </w:rPr>
-        <w:t xml:space="preserve">D.  </w:t>
-      </w:r>
-      <w:r>
-        <w:t xml:space="preserve">The square was skipped: 3(0)² + 1 is 4.</w:t>
-      </w:r>
-    </w:p>
-    <w:p>
-      <w:pPr>
-        <w:pStyle w:val="Heading3"/>
-        <w:keepNext/>
-      </w:pPr>
-      <w:r>
-        <w:t xml:space="preserve">Answer and reasoning</w:t>
-      </w:r>
-    </w:p>
-    <w:p>
-      <w:pPr>
-        <w:spacing w:after="120" w:before="80" w:line="300"/>
-      </w:pPr>
-      <w:r>
-        <w:rPr>
-          <w:i/>
-          <w:iCs/>
-        </w:rPr>
-        <w:t xml:space="preserve">−5&lt; x&lt;0</w:t>
-      </w:r>
-      <w:r>
-        <w:t xml:space="preserve"> leaves 0 out, and </w:t>
-      </w:r>
-      <w:r>
-        <w:rPr>
-          <w:i/>
-          <w:iCs/>
-        </w:rPr>
-        <w:t xml:space="preserve">0≤ x&lt;5</w:t>
-      </w:r>
-      <w:r>
-        <w:t xml:space="preserve"> includes it, so </w:t>
-      </w:r>
-      <w:r>
-        <w:rPr>
-          <w:i/>
-          <w:iCs/>
-        </w:rPr>
-        <w:t xml:space="preserve">m(0)=√(0</w:t>
-      </w:r>
-      <w:r>
-        <w:rPr>
-          <w:i/>
-          <w:iCs/>
-          <w:vertAlign w:val="superscript"/>
-        </w:rPr>
-        <w:t xml:space="preserve">2</w:t>
-      </w:r>
-      <w:r>
-        <w:rPr>
-          <w:i/>
-          <w:iCs/>
-        </w:rPr>
-        <w:t xml:space="preserve">+5)=√5</w:t>
-      </w:r>
-      <w:r>
-        <w:t xml:space="preserve">. The function is defined at 0, since one piece includes it, and </w:t>
-      </w:r>
-      <w:r>
-        <w:rPr>
-          <w:i/>
-          <w:iCs/>
-        </w:rPr>
-        <w:t xml:space="preserve">3(0)</w:t>
-      </w:r>
-      <w:r>
-        <w:rPr>
-          <w:i/>
-          <w:iCs/>
-          <w:vertAlign w:val="superscript"/>
-        </w:rPr>
-        <w:t xml:space="preserve">2</w:t>
-      </w:r>
-      <w:r>
-        <w:rPr>
-          <w:i/>
-          <w:iCs/>
-        </w:rPr>
-        <w:t xml:space="preserve">+1</w:t>
-      </w:r>
-      <w:r>
-        <w:t xml:space="preserve"> really is 1, just from the wrong piece. </w:t>
-      </w:r>
-      <w:r>
-        <w:rPr>
-          <w:b/>
-          <w:bCs/>
-        </w:rPr>
-        <w:t xml:space="preserve">0 belongs to the radical piece: </w:t>
-      </w:r>
-      <w:r>
-        <w:rPr>
-          <w:b/>
-          <w:bCs/>
-          <w:i/>
-          <w:iCs/>
-        </w:rPr>
-        <w:t xml:space="preserve">m(0)=√5</w:t>
-      </w:r>
-      <w:r>
-        <w:rPr>
-          <w:b/>
-          <w:bCs/>
-        </w:rPr>
-        <w:t xml:space="preserve">.</w:t>
-      </w:r>
-    </w:p>
-    <w:p>
-      <w:pPr>
-        <w:pStyle w:val="Heading2"/>
-        <w:pageBreakBefore/>
-      </w:pPr>
-      <w:r>
-        <w:t xml:space="preserve">Example 14: Slip 2</w:t>
-      </w:r>
-    </w:p>
-    <w:p>
-      <w:pPr>
-        <w:spacing w:after="40" w:before="200"/>
-        <w:jc w:val="center"/>
-      </w:pPr>
-      <w:r>
-        <w:rPr>
-          <w:i/>
-          <w:iCs/>
-          <w:sz w:val="40"/>
-          <w:szCs w:val="40"/>
-        </w:rPr>
-        <w:t xml:space="preserve">m(−2)=3(−2)</w:t>
-      </w:r>
-      <w:r>
-        <w:rPr>
-          <w:i/>
-          <w:iCs/>
-          <w:sz w:val="40"/>
-          <w:szCs w:val="40"/>
-          <w:vertAlign w:val="superscript"/>
-        </w:rPr>
-        <w:t xml:space="preserve">2</w:t>
-      </w:r>
-      <w:r>
-        <w:rPr>
-          <w:i/>
-          <w:iCs/>
-          <w:sz w:val="40"/>
-          <w:szCs w:val="40"/>
-        </w:rPr>
-        <w:t xml:space="preserve">+1</w:t>
-      </w:r>
-    </w:p>
-    <w:p>
-      <w:pPr>
-        <w:spacing w:after="40" w:before="40"/>
-        <w:jc w:val="center"/>
-      </w:pPr>
-      <w:r>
-        <w:rPr>
-          <w:i/>
-          <w:iCs/>
-          <w:sz w:val="40"/>
-          <w:szCs w:val="40"/>
-        </w:rPr>
-        <w:t xml:space="preserve">=−12+1</w:t>
-      </w:r>
-    </w:p>
-    <w:p>
-      <w:pPr>
-        <w:spacing w:after="200" w:before="40"/>
-        <w:jc w:val="center"/>
-      </w:pPr>
-      <w:r>
-        <w:rPr>
-          <w:i/>
-          <w:iCs/>
-          <w:sz w:val="40"/>
-          <w:szCs w:val="40"/>
-        </w:rPr>
-        <w:t xml:space="preserve">=−11</w:t>
-      </w:r>
-    </w:p>
-    <w:p>
-      <w:pPr>
-        <w:pStyle w:val="Heading3"/>
-        <w:keepNext/>
-      </w:pPr>
-      <w:r>
-        <w:t xml:space="preserve">Question</w:t>
-      </w:r>
-    </w:p>
-    <w:p>
-      <w:pPr>
-        <w:spacing w:after="120" w:before="80" w:line="300"/>
-      </w:pPr>
-      <w:r>
-        <w:t xml:space="preserve">Using the same m, a student found m(−2) this way. What is the mistake, if any?</w:t>
-      </w:r>
-    </w:p>
-    <w:p>
-      <w:pPr>
-        <w:spacing w:after="40" w:before="20"/>
-        <w:ind w:left="360"/>
-      </w:pPr>
-      <w:r>
-        <w:rPr>
-          <w:b/>
-          <w:bCs/>
-        </w:rPr>
-        <w:t xml:space="preserve">A.  </w:t>
-      </w:r>
-      <w:r>
-        <w:t xml:space="preserve">There is no mistake.</w:t>
-      </w:r>
-    </w:p>
-    <w:p>
-      <w:pPr>
-        <w:spacing w:after="40" w:before="20"/>
-        <w:ind w:left="360"/>
-      </w:pPr>
-      <w:r>
-        <w:rPr>
-          <w:b/>
-          <w:bCs/>
-        </w:rPr>
-        <w:t xml:space="preserve">B.  </w:t>
-      </w:r>
-      <w:r>
-        <w:t xml:space="preserve">−2 belongs to the radical piece, so m(−2) = 3.</w:t>
-      </w:r>
-    </w:p>
-    <w:p>
-      <w:pPr>
-        <w:spacing w:after="40" w:before="20"/>
-        <w:ind w:left="360"/>
-      </w:pPr>
-      <w:r>
-        <w:rPr>
-          <w:b/>
-          <w:bCs/>
-        </w:rPr>
-        <w:t xml:space="preserve">C.  </w:t>
-      </w:r>
-      <w:r>
-        <w:t xml:space="preserve">It should be 3(−2) + 1 = −5, without the square.</w:t>
-      </w:r>
-    </w:p>
-    <w:p>
-      <w:pPr>
-        <w:spacing w:after="40" w:before="20"/>
-        <w:ind w:left="360"/>
-      </w:pPr>
-      <w:r>
-        <w:rPr>
-          <w:b/>
-          <w:bCs/>
-        </w:rPr>
-        <w:t xml:space="preserve">D.  </w:t>
-      </w:r>
-      <w:r>
-        <w:t xml:space="preserve">(−2)² is 4, not −4, so m(−2) = 13.</w:t>
-      </w:r>
-    </w:p>
-    <w:p>
-      <w:pPr>
-        <w:pStyle w:val="Heading3"/>
-        <w:keepNext/>
-      </w:pPr>
-      <w:r>
-        <w:t xml:space="preserve">Answer and reasoning</w:t>
-      </w:r>
-    </w:p>
-    <w:p>
-      <w:pPr>
-        <w:spacing w:after="120" w:before="80" w:line="300"/>
-      </w:pPr>
-      <w:r>
-        <w:t xml:space="preserve">The piece is right, since −2 is between −5 and 0. But </w:t>
-      </w:r>
-      <w:r>
-        <w:rPr>
-          <w:i/>
-          <w:iCs/>
-        </w:rPr>
-        <w:t xml:space="preserve">(−2)</w:t>
-      </w:r>
-      <w:r>
-        <w:rPr>
-          <w:i/>
-          <w:iCs/>
-          <w:vertAlign w:val="superscript"/>
-        </w:rPr>
-        <w:t xml:space="preserve">2</w:t>
-      </w:r>
-      <w:r>
-        <w:rPr>
-          <w:i/>
-          <w:iCs/>
-        </w:rPr>
-        <w:t xml:space="preserve">=(−2)(−2)=4</w:t>
-      </w:r>
-      <w:r>
-        <w:t xml:space="preserve">, so </w:t>
-      </w:r>
-      <w:r>
-        <w:rPr>
-          <w:i/>
-          <w:iCs/>
-        </w:rPr>
-        <w:t xml:space="preserve">m(−2)=3(4)+1=13</w:t>
-      </w:r>
-      <w:r>
-        <w:t xml:space="preserve">. The radical piece starts at 0, and the square is part of the formula; dropping it changes the function. </w:t>
-      </w:r>
-      <w:r>
-        <w:rPr>
-          <w:b/>
-          <w:bCs/>
-          <w:i/>
-          <w:iCs/>
-        </w:rPr>
-        <w:t xml:space="preserve">(−2)</w:t>
-      </w:r>
-      <w:r>
-        <w:rPr>
-          <w:b/>
-          <w:bCs/>
-          <w:i/>
-          <w:iCs/>
-          <w:vertAlign w:val="superscript"/>
-        </w:rPr>
-        <w:t xml:space="preserve">2</w:t>
-      </w:r>
-      <w:r>
-        <w:rPr>
-          <w:b/>
-          <w:bCs/>
-          <w:i/>
-          <w:iCs/>
-        </w:rPr>
-        <w:t xml:space="preserve">=4</w:t>
-      </w:r>
-      <w:r>
-        <w:rPr>
-          <w:b/>
-          <w:bCs/>
-        </w:rPr>
-        <w:t xml:space="preserve">: </w:t>
-      </w:r>
-      <w:r>
-        <w:rPr>
-          <w:b/>
-          <w:bCs/>
-          <w:i/>
-          <w:iCs/>
-        </w:rPr>
-        <w:t xml:space="preserve">m(−2)=13</w:t>
-      </w:r>
-      <w:r>
-        <w:rPr>
-          <w:b/>
-          <w:bCs/>
-        </w:rPr>
-        <w:t xml:space="preserve">.</w:t>
-      </w:r>
-    </w:p>
-    <w:p>
-      <w:pPr>
-        <w:pStyle w:val="Heading2"/>
-        <w:pageBreakBefore/>
-      </w:pPr>
-      <w:r>
-        <w:t xml:space="preserve">Example 15: Slip 3</w:t>
-      </w:r>
-    </w:p>
-    <w:p>
-      <w:pPr>
-        <w:spacing w:after="40" w:before="200"/>
-        <w:jc w:val="center"/>
-      </w:pPr>
-      <w:r>
-        <w:rPr>
-          <w:i/>
-          <w:iCs/>
-          <w:sz w:val="40"/>
-          <w:szCs w:val="40"/>
-        </w:rPr>
-        <w:t xml:space="preserve">k(−2)=(4(−2)−3)/(2(−2)</w:t>
-      </w:r>
-      <w:r>
-        <w:rPr>
-          <w:i/>
-          <w:iCs/>
-          <w:sz w:val="40"/>
-          <w:szCs w:val="40"/>
-          <w:vertAlign w:val="superscript"/>
-        </w:rPr>
-        <w:t xml:space="preserve">2</w:t>
-      </w:r>
-      <w:r>
-        <w:rPr>
-          <w:i/>
-          <w:iCs/>
-          <w:sz w:val="40"/>
-          <w:szCs w:val="40"/>
-        </w:rPr>
-        <w:t xml:space="preserve">+1)</w:t>
-      </w:r>
-    </w:p>
-    <w:p>
-      <w:pPr>
-        <w:spacing w:after="200" w:before="40"/>
-        <w:jc w:val="center"/>
-      </w:pPr>
-      <w:r>
-        <w:rPr>
-          <w:i/>
-          <w:iCs/>
-          <w:sz w:val="40"/>
-          <w:szCs w:val="40"/>
-        </w:rPr>
-        <w:t xml:space="preserve">=(−11)/9</w:t>
-      </w:r>
-    </w:p>
-    <w:p>
-      <w:pPr>
-        <w:pStyle w:val="Heading3"/>
-        <w:keepNext/>
-      </w:pPr>
-      <w:r>
-        <w:t xml:space="preserve">Question</w:t>
-      </w:r>
-    </w:p>
-    <w:p>
-      <w:pPr>
-        <w:spacing w:after="120" w:before="80" w:line="300"/>
-      </w:pPr>
-      <w:r>
-        <w:t xml:space="preserve">For the function k from earlier, with the fraction piece on </w:t>
-      </w:r>
-      <w:r>
-        <w:rPr>
-          <w:i/>
-          <w:iCs/>
-        </w:rPr>
-        <w:t xml:space="preserve">−5&lt; x&lt; −1</w:t>
-      </w:r>
-      <w:r>
-        <w:t xml:space="preserve">, a student found k(−2) this way. What is the mistake, if any?</w:t>
-      </w:r>
-    </w:p>
-    <w:p>
-      <w:pPr>
-        <w:spacing w:after="40" w:before="20"/>
-        <w:ind w:left="360"/>
-      </w:pPr>
-      <w:r>
-        <w:rPr>
-          <w:b/>
-          <w:bCs/>
-        </w:rPr>
-        <w:t xml:space="preserve">A.  </w:t>
-      </w:r>
-      <w:r>
-        <w:t xml:space="preserve">There is no mistake.</w:t>
-      </w:r>
-    </w:p>
-    <w:p>
-      <w:pPr>
-        <w:spacing w:after="40" w:before="20"/>
-        <w:ind w:left="360"/>
-      </w:pPr>
-      <w:r>
-        <w:rPr>
-          <w:b/>
-          <w:bCs/>
-        </w:rPr>
-        <w:t xml:space="preserve">B.  </w:t>
-      </w:r>
-      <w:r>
-        <w:t xml:space="preserve">−2 belongs to the other piece, so k(−2) = 0.</w:t>
-      </w:r>
-    </w:p>
-    <w:p>
-      <w:pPr>
-        <w:spacing w:after="40" w:before="20"/>
-        <w:ind w:left="360"/>
-      </w:pPr>
-      <w:r>
-        <w:rPr>
-          <w:b/>
-          <w:bCs/>
-        </w:rPr>
-        <w:t xml:space="preserve">C.  </w:t>
-      </w:r>
-      <w:r>
-        <w:t xml:space="preserve">The bottom should be 2(−4) + 1 = −7, so it is 11/7.</w:t>
-      </w:r>
-    </w:p>
-    <w:p>
-      <w:pPr>
-        <w:spacing w:after="40" w:before="20"/>
-        <w:ind w:left="360"/>
-      </w:pPr>
-      <w:r>
-        <w:rPr>
-          <w:b/>
-          <w:bCs/>
-        </w:rPr>
-        <w:t xml:space="preserve">D.  </w:t>
-      </w:r>
-      <w:r>
-        <w:t xml:space="preserve">The answer should be a decimal, −1.2.</w:t>
-      </w:r>
-    </w:p>
-    <w:p>
-      <w:pPr>
-        <w:pStyle w:val="Heading3"/>
-        <w:keepNext/>
-      </w:pPr>
-      <w:r>
-        <w:t xml:space="preserve">Answer and reasoning</w:t>
-      </w:r>
-    </w:p>
-    <w:p>
-      <w:pPr>
-        <w:spacing w:after="120" w:before="80" w:line="300"/>
-      </w:pPr>
-      <w:r>
-        <w:t xml:space="preserve">−2 is between −5 and −1, so the fraction piece is the right one. Top: </w:t>
-      </w:r>
-      <w:r>
-        <w:rPr>
-          <w:i/>
-          <w:iCs/>
-        </w:rPr>
-        <w:t xml:space="preserve">4(−2)−3=−11</w:t>
-      </w:r>
-      <w:r>
-        <w:t xml:space="preserve">. Bottom: </w:t>
-      </w:r>
-      <w:r>
-        <w:rPr>
-          <w:i/>
-          <w:iCs/>
-        </w:rPr>
-        <w:t xml:space="preserve">2(−2)</w:t>
-      </w:r>
-      <w:r>
-        <w:rPr>
-          <w:i/>
-          <w:iCs/>
-          <w:vertAlign w:val="superscript"/>
-        </w:rPr>
-        <w:t xml:space="preserve">2</w:t>
-      </w:r>
-      <w:r>
-        <w:rPr>
-          <w:i/>
-          <w:iCs/>
-        </w:rPr>
-        <w:t xml:space="preserve">+1=2(4)+1=9</w:t>
-      </w:r>
-      <w:r>
-        <w:t xml:space="preserve">. So </w:t>
-      </w:r>
-      <w:r>
-        <w:rPr>
-          <w:i/>
-          <w:iCs/>
-        </w:rPr>
-        <w:t xml:space="preserve">k(−2)=−11/9</w:t>
-      </w:r>
-      <w:r>
-        <w:t xml:space="preserve">, exact, as CheckIt wants. The other piece starts at −1, and </w:t>
-      </w:r>
-      <w:r>
-        <w:rPr>
-          <w:i/>
-          <w:iCs/>
-        </w:rPr>
-        <w:t xml:space="preserve">(−2)</w:t>
-      </w:r>
-      <w:r>
-        <w:rPr>
-          <w:i/>
-          <w:iCs/>
-          <w:vertAlign w:val="superscript"/>
-        </w:rPr>
-        <w:t xml:space="preserve">2</w:t>
-      </w:r>
-      <w:r>
-        <w:t xml:space="preserve"> is 4, not −4. </w:t>
-      </w:r>
-      <w:r>
-        <w:rPr>
-          <w:b/>
-          <w:bCs/>
-        </w:rPr>
-        <w:t xml:space="preserve">There is no mistake.</w:t>
-      </w:r>
-    </w:p>
-    <w:p>
-      <w:pPr>
-        <w:pStyle w:val="Heading2"/>
-        <w:pageBreakBefore/>
-      </w:pPr>
-      <w:r>
-        <w:t xml:space="preserve">Example 16: Slip 4</w:t>
+        <w:t xml:space="preserve">Example 9: Just One</w:t>
       </w:r>
     </w:p>
     <w:p>
@@ -4061,9 +2555,9 @@
       <w:r>
         <w:drawing>
           <wp:inline distT="0" distB="0" distL="0" distR="0">
-            <wp:extent cx="2981325" cy="2476500"/>
+            <wp:extent cx="3305175" cy="2476500"/>
             <wp:effectExtent t="0" r="0" b="0" l="0"/>
-            <wp:docPr id="1" name="sl4" descr="The graph of g, made of three straight segments. Plotted data: A graph of g on the interval from x = −5 to x = 4, drawn on a grid with lines every 1 unit. It is made of three straight segments: from (−5, −1) up to (−3, 3), then down to (1, −1), then up to (4, 5). The ends and corners are marked with dots." title="The graph of g, made of three straight segments"/>
+            <wp:docPr id="1" name="io1" descr="The graph of g, made of three straight segments. Plotted data: A graph of g on the interval from x = −4 to x = 5, drawn on a grid with lines every 1 unit. It is made of three straight segments: from (−4, 4) down to (−1, −2), then up to (3, 2), then down to (5, 0). The ends and corners are marked with dots." title="The graph of g, made of three straight segments"/>
             <wp:cNvGraphicFramePr>
               <a:graphicFrameLocks xmlns:a="http://schemas.openxmlformats.org/drawingml/2006/main" noChangeAspect="1"/>
             </wp:cNvGraphicFramePr>
@@ -4086,7 +2580,7 @@
                   <pic:spPr bwMode="auto">
                     <a:xfrm>
                       <a:off x="0" y="0"/>
-                      <a:ext cx="2981325" cy="2476500"/>
+                      <a:ext cx="3305175" cy="2476500"/>
                     </a:xfrm>
                     <a:prstGeom prst="rect">
                       <a:avLst/>
@@ -4117,7 +2611,7 @@
           <w:sz w:val="22"/>
           <w:szCs w:val="22"/>
         </w:rPr>
-        <w:t xml:space="preserve">A graph of g on the interval from x = −5 to x = 4, drawn on a grid with lines every 1 unit. It is made of three straight segments: from (−5, −1) up to (−3, 3), then down to (1, −1), then up to (4, 5). The ends and corners are marked with dots.</w:t>
+        <w:t xml:space="preserve">A graph of g on the interval from x = −4 to x = 5, drawn on a grid with lines every 1 unit. It is made of three straight segments: from (−4, 4) down to (−1, −2), then up to (3, 2), then down to (5, 0). The ends and corners are marked with dots.</w:t>
       </w:r>
     </w:p>
     <w:p>
@@ -4134,7 +2628,7 @@
         <w:spacing w:after="120" w:before="80" w:line="300"/>
       </w:pPr>
       <w:r>
-        <w:t xml:space="preserve">For which x in [−5, 4] does g(x) = −1? A student answered x = 1 only. What is the mistake, if any?</w:t>
+        <w:t xml:space="preserve">For which x-values in [−4, 5] does g(x) = −2?</w:t>
       </w:r>
     </w:p>
     <w:p>
@@ -4150,7 +2644,7 @@
         <w:t xml:space="preserve">A.  </w:t>
       </w:r>
       <w:r>
-        <w:t xml:space="preserve">There is no mistake.</w:t>
+        <w:t xml:space="preserve">x = −2</w:t>
       </w:r>
     </w:p>
     <w:p>
@@ -4166,7 +2660,7 @@
         <w:t xml:space="preserve">B.  </w:t>
       </w:r>
       <w:r>
-        <w:t xml:space="preserve">x = −5 counts too: the left end is at height −1.</w:t>
+        <w:t xml:space="preserve">x = −1 and x = 3, the two corners</w:t>
       </w:r>
     </w:p>
     <w:p>
@@ -4182,7 +2676,7 @@
         <w:t xml:space="preserve">C.  </w:t>
       </w:r>
       <w:r>
-        <w:t xml:space="preserve">The answer should be the output g(1) = −1, not an x-value.</w:t>
+        <w:t xml:space="preserve">There is none, since corners do not count.</w:t>
       </w:r>
     </w:p>
     <w:p>
@@ -4198,7 +2692,7 @@
         <w:t xml:space="preserve">D.  </w:t>
       </w:r>
       <w:r>
-        <w:t xml:space="preserve">Corners do not count, so there is no x with g(x) = −1.</w:t>
+        <w:t xml:space="preserve">x = −1 only</w:t>
       </w:r>
     </w:p>
     <w:p>
@@ -4215,99 +2709,63 @@
         <w:spacing w:after="120" w:before="80" w:line="300"/>
       </w:pPr>
       <w:r>
-        <w:t xml:space="preserve">The line </w:t>
-      </w:r>
-      <w:r>
-        <w:rPr>
-          <w:i/>
-          <w:iCs/>
-        </w:rPr>
-        <w:t xml:space="preserve">y=−1</w:t>
-      </w:r>
-      <w:r>
-        <w:t xml:space="preserve"> touches the graph at the corner </w:t>
-      </w:r>
-      <w:r>
-        <w:rPr>
-          <w:i/>
-          <w:iCs/>
-        </w:rPr>
-        <w:t xml:space="preserve">(1,−1)</w:t>
-      </w:r>
-      <w:r>
-        <w:t xml:space="preserve"> and at the left end </w:t>
-      </w:r>
-      <w:r>
-        <w:rPr>
-          <w:i/>
-          <w:iCs/>
-        </w:rPr>
-        <w:t xml:space="preserve">(−5,−1)</w:t>
-      </w:r>
-      <w:r>
-        <w:t xml:space="preserve">. Both are on the graph, and −5 is in the interval, so </w:t>
-      </w:r>
-      <w:r>
-        <w:rPr>
-          <w:i/>
-          <w:iCs/>
-        </w:rPr>
-        <w:t xml:space="preserve">x=−5</w:t>
-      </w:r>
-      <w:r>
-        <w:t xml:space="preserve"> and </w:t>
-      </w:r>
-      <w:r>
-        <w:rPr>
-          <w:i/>
-          <w:iCs/>
-        </w:rPr>
-        <w:t xml:space="preserve">x=1</w:t>
-      </w:r>
-      <w:r>
-        <w:t xml:space="preserve">. The question asks for inputs, so the answer is </w:t>
-      </w:r>
-      <w:r>
-        <w:rPr>
-          <w:i/>
-          <w:iCs/>
-        </w:rPr>
-        <w:t xml:space="preserve">x</w:t>
-      </w:r>
-      <w:r>
-        <w:t xml:space="preserve">-values, and corners and ends are points of the graph like any other. </w:t>
-      </w:r>
-      <w:r>
-        <w:rPr>
-          <w:b/>
-          <w:bCs/>
-          <w:i/>
-          <w:iCs/>
-        </w:rPr>
-        <w:t xml:space="preserve">x=−5</w:t>
-      </w:r>
-      <w:r>
-        <w:rPr>
-          <w:b/>
-          <w:bCs/>
-        </w:rPr>
-        <w:t xml:space="preserve"> and </w:t>
-      </w:r>
-      <w:r>
-        <w:rPr>
-          <w:b/>
-          <w:bCs/>
-          <w:i/>
-          <w:iCs/>
-        </w:rPr>
-        <w:t xml:space="preserve">x=1</w:t>
-      </w:r>
-      <w:r>
-        <w:rPr>
-          <w:b/>
-          <w:bCs/>
-        </w:rPr>
-        <w:t xml:space="preserve">.</w:t>
+        <w:t xml:space="preserve">Draw the horizontal line </w:t>
+      </w:r>
+      <w:r>
+        <w:rPr>
+          <w:i/>
+          <w:iCs/>
+        </w:rPr>
+        <w:t xml:space="preserve">y=−2</w:t>
+      </w:r>
+      <w:r>
+        <w:t xml:space="preserve">. It touches the graph only at the lowest corner, </w:t>
+      </w:r>
+      <w:r>
+        <w:rPr>
+          <w:i/>
+          <w:iCs/>
+        </w:rPr>
+        <w:t xml:space="preserve">(−1,−2)</w:t>
+      </w:r>
+      <w:r>
+        <w:t xml:space="preserve">, so there is exactly one input: </w:t>
+      </w:r>
+      <w:r>
+        <w:rPr>
+          <w:i/>
+          <w:iCs/>
+        </w:rPr>
+        <w:t xml:space="preserve">x=−1</w:t>
+      </w:r>
+      <w:r>
+        <w:t xml:space="preserve">. Many CheckIt problems have just one answer like this. </w:t>
+      </w:r>
+      <w:r>
+        <w:rPr>
+          <w:i/>
+          <w:iCs/>
+        </w:rPr>
+        <w:t xml:space="preserve">x=−2</w:t>
+      </w:r>
+      <w:r>
+        <w:t xml:space="preserve"> copies the output as an input; the corner at 3 is at height 2, not −2; and a corner is a point on the graph like any other. </w:t>
+      </w:r>
+      <w:r>
+        <w:rPr>
+          <w:b/>
+          <w:bCs/>
+          <w:i/>
+          <w:iCs/>
+        </w:rPr>
+        <w:t xml:space="preserve">x=−1</w:t>
+      </w:r>
+      <w:r>
+        <w:rPr>
+          <w:b/>
+          <w:bCs/>
+        </w:rPr>
+        <w:t xml:space="preserve"> only.</w:t>
       </w:r>
     </w:p>
     <w:p>
@@ -4316,7 +2774,1460 @@
         <w:pageBreakBefore/>
       </w:pPr>
       <w:r>
-        <w:t xml:space="preserve">Example 17: Slip 5</w:t>
+        <w:t xml:space="preserve">Example 10: What It Means</w:t>
+      </w:r>
+    </w:p>
+    <w:p>
+      <w:pPr>
+        <w:spacing w:after="200" w:before="200"/>
+        <w:jc w:val="center"/>
+      </w:pPr>
+      <w:r>
+        <w:rPr>
+          <w:i/>
+          <w:iCs/>
+          <w:sz w:val="40"/>
+          <w:szCs w:val="40"/>
+        </w:rPr>
+        <w:t xml:space="preserve">C(10)=150</w:t>
+      </w:r>
+    </w:p>
+    <w:p>
+      <w:pPr>
+        <w:pStyle w:val="Heading3"/>
+        <w:keepNext/>
+      </w:pPr>
+      <w:r>
+        <w:t xml:space="preserve">Question</w:t>
+      </w:r>
+    </w:p>
+    <w:p>
+      <w:pPr>
+        <w:spacing w:after="120" w:before="80" w:line="300"/>
+      </w:pPr>
+      <w:r>
+        <w:t xml:space="preserve">C(m) is the temperature of a cup of coffee, in degrees Fahrenheit, m minutes after it is poured. What does C(10) = 150 mean?</w:t>
+      </w:r>
+    </w:p>
+    <w:p>
+      <w:pPr>
+        <w:spacing w:after="40" w:before="20"/>
+        <w:ind w:left="360"/>
+      </w:pPr>
+      <w:r>
+        <w:rPr>
+          <w:b/>
+          <w:bCs/>
+        </w:rPr>
+        <w:t xml:space="preserve">A.  </w:t>
+      </w:r>
+      <w:r>
+        <w:t xml:space="preserve">10 minutes after it is poured, the coffee is 150°F.</w:t>
+      </w:r>
+    </w:p>
+    <w:p>
+      <w:pPr>
+        <w:spacing w:after="40" w:before="20"/>
+        <w:ind w:left="360"/>
+      </w:pPr>
+      <w:r>
+        <w:rPr>
+          <w:b/>
+          <w:bCs/>
+        </w:rPr>
+        <w:t xml:space="preserve">B.  </w:t>
+      </w:r>
+      <w:r>
+        <w:t xml:space="preserve">150 minutes after it is poured, the coffee is 10°F.</w:t>
+      </w:r>
+    </w:p>
+    <w:p>
+      <w:pPr>
+        <w:spacing w:after="40" w:before="20"/>
+        <w:ind w:left="360"/>
+      </w:pPr>
+      <w:r>
+        <w:rPr>
+          <w:b/>
+          <w:bCs/>
+        </w:rPr>
+        <w:t xml:space="preserve">C.  </w:t>
+      </w:r>
+      <w:r>
+        <w:t xml:space="preserve">The coffee cools by 150 degrees in 10 minutes.</w:t>
+      </w:r>
+    </w:p>
+    <w:p>
+      <w:pPr>
+        <w:spacing w:after="40" w:before="20"/>
+        <w:ind w:left="360"/>
+      </w:pPr>
+      <w:r>
+        <w:rPr>
+          <w:b/>
+          <w:bCs/>
+        </w:rPr>
+        <w:t xml:space="preserve">D.  </w:t>
+      </w:r>
+      <w:r>
+        <w:t xml:space="preserve">C times 10 equals 150, so C is 15.</w:t>
+      </w:r>
+    </w:p>
+    <w:p>
+      <w:pPr>
+        <w:pStyle w:val="Heading3"/>
+        <w:keepNext/>
+      </w:pPr>
+      <w:r>
+        <w:t xml:space="preserve">Answer and reasoning</w:t>
+      </w:r>
+    </w:p>
+    <w:p>
+      <w:pPr>
+        <w:spacing w:after="120" w:before="80" w:line="300"/>
+      </w:pPr>
+      <w:r>
+        <w:t xml:space="preserve">The input, in the parentheses, is the time: 10 minutes. The output is the temperature: 150°F. Swapping them reads the notation backwards; "cools by 150" turns an output into a change, which the notation does not say; and </w:t>
+      </w:r>
+      <w:r>
+        <w:rPr>
+          <w:i/>
+          <w:iCs/>
+        </w:rPr>
+        <w:t xml:space="preserve">C(10)</w:t>
+      </w:r>
+      <w:r>
+        <w:t xml:space="preserve"> is not multiplication: </w:t>
+      </w:r>
+      <w:r>
+        <w:rPr>
+          <w:i/>
+          <w:iCs/>
+        </w:rPr>
+        <w:t xml:space="preserve">C</w:t>
+      </w:r>
+      <w:r>
+        <w:t xml:space="preserve"> is the name of the function. </w:t>
+      </w:r>
+      <w:r>
+        <w:rPr>
+          <w:b/>
+          <w:bCs/>
+        </w:rPr>
+        <w:t xml:space="preserve">10 minutes after it is poured, the coffee is 150°F.</w:t>
+      </w:r>
+    </w:p>
+    <w:p>
+      <w:pPr>
+        <w:pStyle w:val="Heading2"/>
+        <w:pageBreakBefore/>
+      </w:pPr>
+      <w:r>
+        <w:t xml:space="preserve">Example 11: On the Graph</w:t>
+      </w:r>
+    </w:p>
+    <w:p>
+      <w:pPr>
+        <w:spacing w:after="200" w:before="200"/>
+        <w:jc w:val="center"/>
+      </w:pPr>
+      <w:r>
+        <w:rPr>
+          <w:i/>
+          <w:iCs/>
+          <w:sz w:val="40"/>
+          <w:szCs w:val="40"/>
+        </w:rPr>
+        <w:t xml:space="preserve">h(−2)=5</w:t>
+      </w:r>
+    </w:p>
+    <w:p>
+      <w:pPr>
+        <w:pStyle w:val="Heading3"/>
+        <w:keepNext/>
+      </w:pPr>
+      <w:r>
+        <w:t xml:space="preserve">Question</w:t>
+      </w:r>
+    </w:p>
+    <w:p>
+      <w:pPr>
+        <w:spacing w:after="120" w:before="80" w:line="300"/>
+      </w:pPr>
+      <w:r>
+        <w:t xml:space="preserve">Which point must be on the graph of h?</w:t>
+      </w:r>
+    </w:p>
+    <w:p>
+      <w:pPr>
+        <w:spacing w:after="40" w:before="20"/>
+        <w:ind w:left="360"/>
+      </w:pPr>
+      <w:r>
+        <w:rPr>
+          <w:b/>
+          <w:bCs/>
+        </w:rPr>
+        <w:t xml:space="preserve">A.  </w:t>
+      </w:r>
+      <w:r>
+        <w:t xml:space="preserve">(5, −2)</w:t>
+      </w:r>
+    </w:p>
+    <w:p>
+      <w:pPr>
+        <w:spacing w:after="40" w:before="20"/>
+        <w:ind w:left="360"/>
+      </w:pPr>
+      <w:r>
+        <w:rPr>
+          <w:b/>
+          <w:bCs/>
+        </w:rPr>
+        <w:t xml:space="preserve">B.  </w:t>
+      </w:r>
+      <w:r>
+        <w:t xml:space="preserve">(−2, −5)</w:t>
+      </w:r>
+    </w:p>
+    <w:p>
+      <w:pPr>
+        <w:spacing w:after="40" w:before="20"/>
+        <w:ind w:left="360"/>
+      </w:pPr>
+      <w:r>
+        <w:rPr>
+          <w:b/>
+          <w:bCs/>
+        </w:rPr>
+        <w:t xml:space="preserve">C.  </w:t>
+      </w:r>
+      <w:r>
+        <w:t xml:space="preserve">(0, 5)</w:t>
+      </w:r>
+    </w:p>
+    <w:p>
+      <w:pPr>
+        <w:spacing w:after="40" w:before="20"/>
+        <w:ind w:left="360"/>
+      </w:pPr>
+      <w:r>
+        <w:rPr>
+          <w:b/>
+          <w:bCs/>
+        </w:rPr>
+        <w:t xml:space="preserve">D.  </w:t>
+      </w:r>
+      <w:r>
+        <w:t xml:space="preserve">(−2, 5)</w:t>
+      </w:r>
+    </w:p>
+    <w:p>
+      <w:pPr>
+        <w:pStyle w:val="Heading3"/>
+        <w:keepNext/>
+      </w:pPr>
+      <w:r>
+        <w:t xml:space="preserve">Answer and reasoning</w:t>
+      </w:r>
+    </w:p>
+    <w:p>
+      <w:pPr>
+        <w:spacing w:after="120" w:before="80" w:line="300"/>
+      </w:pPr>
+      <w:r>
+        <w:rPr>
+          <w:i/>
+          <w:iCs/>
+        </w:rPr>
+        <w:t xml:space="preserve">h(−2)=5</w:t>
+      </w:r>
+      <w:r>
+        <w:t xml:space="preserve"> says the input −2 gives the output 5, and points are written (input, output). So </w:t>
+      </w:r>
+      <w:r>
+        <w:rPr>
+          <w:i/>
+          <w:iCs/>
+        </w:rPr>
+        <w:t xml:space="preserve">(−2,5)</w:t>
+      </w:r>
+      <w:r>
+        <w:t xml:space="preserve">. </w:t>
+      </w:r>
+      <w:r>
+        <w:rPr>
+          <w:i/>
+          <w:iCs/>
+        </w:rPr>
+        <w:t xml:space="preserve">(5,−2)</w:t>
+      </w:r>
+      <w:r>
+        <w:t xml:space="preserve"> swaps input and output; </w:t>
+      </w:r>
+      <w:r>
+        <w:rPr>
+          <w:i/>
+          <w:iCs/>
+        </w:rPr>
+        <w:t xml:space="preserve">(−2,−5)</w:t>
+      </w:r>
+      <w:r>
+        <w:t xml:space="preserve"> changes the output's sign; and </w:t>
+      </w:r>
+      <w:r>
+        <w:rPr>
+          <w:i/>
+          <w:iCs/>
+        </w:rPr>
+        <w:t xml:space="preserve">(0,5)</w:t>
+      </w:r>
+      <w:r>
+        <w:t xml:space="preserve"> would mean </w:t>
+      </w:r>
+      <w:r>
+        <w:rPr>
+          <w:i/>
+          <w:iCs/>
+        </w:rPr>
+        <w:t xml:space="preserve">h(0)=5</w:t>
+      </w:r>
+      <w:r>
+        <w:t xml:space="preserve">. </w:t>
+      </w:r>
+      <w:r>
+        <w:rPr>
+          <w:b/>
+          <w:bCs/>
+          <w:i/>
+          <w:iCs/>
+        </w:rPr>
+        <w:t xml:space="preserve">(−2,5)</w:t>
+      </w:r>
+      <w:r>
+        <w:rPr>
+          <w:b/>
+          <w:bCs/>
+        </w:rPr>
+        <w:t xml:space="preserve">.</w:t>
+      </w:r>
+    </w:p>
+    <w:p>
+      <w:pPr>
+        <w:pStyle w:val="Heading2"/>
+        <w:pageBreakBefore/>
+      </w:pPr>
+      <w:r>
+        <w:t xml:space="preserve">Example 12: Back to the Input</w:t>
+      </w:r>
+    </w:p>
+    <w:p>
+      <w:pPr>
+        <w:spacing w:after="200" w:before="200"/>
+        <w:jc w:val="center"/>
+      </w:pPr>
+      <w:r>
+        <w:rPr>
+          <w:i/>
+          <w:iCs/>
+          <w:sz w:val="40"/>
+          <w:szCs w:val="40"/>
+        </w:rPr>
+        <w:t xml:space="preserve">f(x)=3x−4</w:t>
+      </w:r>
+    </w:p>
+    <w:p>
+      <w:pPr>
+        <w:pStyle w:val="Heading3"/>
+        <w:keepNext/>
+      </w:pPr>
+      <w:r>
+        <w:t xml:space="preserve">Question</w:t>
+      </w:r>
+    </w:p>
+    <w:p>
+      <w:pPr>
+        <w:spacing w:after="120" w:before="80" w:line="300"/>
+      </w:pPr>
+      <w:r>
+        <w:t xml:space="preserve">For which x does f(x) = 11?</w:t>
+      </w:r>
+    </w:p>
+    <w:p>
+      <w:pPr>
+        <w:spacing w:after="40" w:before="20"/>
+        <w:ind w:left="360"/>
+      </w:pPr>
+      <w:r>
+        <w:rPr>
+          <w:b/>
+          <w:bCs/>
+        </w:rPr>
+        <w:t xml:space="preserve">A.  </w:t>
+      </w:r>
+      <w:r>
+        <w:t xml:space="preserve">x = 29</w:t>
+      </w:r>
+    </w:p>
+    <w:p>
+      <w:pPr>
+        <w:spacing w:after="40" w:before="20"/>
+        <w:ind w:left="360"/>
+      </w:pPr>
+      <w:r>
+        <w:rPr>
+          <w:b/>
+          <w:bCs/>
+        </w:rPr>
+        <w:t xml:space="preserve">B.  </w:t>
+      </w:r>
+      <w:r>
+        <w:t xml:space="preserve">x = 5</w:t>
+      </w:r>
+    </w:p>
+    <w:p>
+      <w:pPr>
+        <w:spacing w:after="40" w:before="20"/>
+        <w:ind w:left="360"/>
+      </w:pPr>
+      <w:r>
+        <w:rPr>
+          <w:b/>
+          <w:bCs/>
+        </w:rPr>
+        <w:t xml:space="preserve">C.  </w:t>
+      </w:r>
+      <w:r>
+        <w:t xml:space="preserve">x = 7/3</w:t>
+      </w:r>
+    </w:p>
+    <w:p>
+      <w:pPr>
+        <w:spacing w:after="40" w:before="20"/>
+        <w:ind w:left="360"/>
+      </w:pPr>
+      <w:r>
+        <w:rPr>
+          <w:b/>
+          <w:bCs/>
+        </w:rPr>
+        <w:t xml:space="preserve">D.  </w:t>
+      </w:r>
+      <w:r>
+        <w:t xml:space="preserve">x = 15</w:t>
+      </w:r>
+    </w:p>
+    <w:p>
+      <w:pPr>
+        <w:pStyle w:val="Heading3"/>
+        <w:keepNext/>
+      </w:pPr>
+      <w:r>
+        <w:t xml:space="preserve">Answer and reasoning</w:t>
+      </w:r>
+    </w:p>
+    <w:p>
+      <w:pPr>
+        <w:spacing w:after="120" w:before="80" w:line="300"/>
+      </w:pPr>
+      <w:r>
+        <w:t xml:space="preserve">Set the output equal to 11 and solve for the input: </w:t>
+      </w:r>
+      <w:r>
+        <w:rPr>
+          <w:i/>
+          <w:iCs/>
+        </w:rPr>
+        <w:t xml:space="preserve">3x−4=11</w:t>
+      </w:r>
+      <w:r>
+        <w:t xml:space="preserve">, </w:t>
+      </w:r>
+      <w:r>
+        <w:rPr>
+          <w:i/>
+          <w:iCs/>
+        </w:rPr>
+        <w:t xml:space="preserve">3x=15</w:t>
+      </w:r>
+      <w:r>
+        <w:t xml:space="preserve">, </w:t>
+      </w:r>
+      <w:r>
+        <w:rPr>
+          <w:i/>
+          <w:iCs/>
+        </w:rPr>
+        <w:t xml:space="preserve">x=5</w:t>
+      </w:r>
+      <w:r>
+        <w:t xml:space="preserve">. Check: </w:t>
+      </w:r>
+      <w:r>
+        <w:rPr>
+          <w:i/>
+          <w:iCs/>
+        </w:rPr>
+        <w:t xml:space="preserve">f(5)=15−4=11</w:t>
+      </w:r>
+      <w:r>
+        <w:t xml:space="preserve">. 29 is </w:t>
+      </w:r>
+      <w:r>
+        <w:rPr>
+          <w:i/>
+          <w:iCs/>
+        </w:rPr>
+        <w:t xml:space="preserve">f(11)</w:t>
+      </w:r>
+      <w:r>
+        <w:t xml:space="preserve">, the output for input 11, the opposite question; </w:t>
+      </w:r>
+      <w:r>
+        <w:rPr>
+          <w:i/>
+          <w:iCs/>
+        </w:rPr>
+        <w:t xml:space="preserve">7/3</w:t>
+      </w:r>
+      <w:r>
+        <w:t xml:space="preserve"> subtracts the 4 instead of adding it; and 15 stops before dividing by 3. </w:t>
+      </w:r>
+      <w:r>
+        <w:rPr>
+          <w:b/>
+          <w:bCs/>
+          <w:i/>
+          <w:iCs/>
+        </w:rPr>
+        <w:t xml:space="preserve">x=5</w:t>
+      </w:r>
+      <w:r>
+        <w:rPr>
+          <w:b/>
+          <w:bCs/>
+        </w:rPr>
+        <w:t xml:space="preserve">.</w:t>
+      </w:r>
+    </w:p>
+    <w:p>
+      <w:pPr>
+        <w:pStyle w:val="Heading2"/>
+        <w:pageBreakBefore/>
+      </w:pPr>
+      <w:r>
+        <w:t xml:space="preserve">Example 13: Slip 1</w:t>
+      </w:r>
+    </w:p>
+    <w:p>
+      <w:pPr>
+        <w:spacing w:after="40" w:before="200"/>
+        <w:jc w:val="center"/>
+      </w:pPr>
+      <w:r>
+        <w:rPr>
+          <w:i/>
+          <w:iCs/>
+          <w:sz w:val="40"/>
+          <w:szCs w:val="40"/>
+        </w:rPr>
+        <w:t xml:space="preserve">m(x)=</w:t>
+      </w:r>
+    </w:p>
+    <w:p>
+      <w:pPr>
+        <w:spacing w:after="40" w:before="40"/>
+        <w:jc w:val="center"/>
+      </w:pPr>
+      <w:r>
+        <w:rPr>
+          <w:i/>
+          <w:iCs/>
+          <w:sz w:val="36"/>
+          <w:szCs w:val="36"/>
+        </w:rPr>
+        <w:t xml:space="preserve">3x</w:t>
+      </w:r>
+      <w:r>
+        <w:rPr>
+          <w:i/>
+          <w:iCs/>
+          <w:sz w:val="36"/>
+          <w:szCs w:val="36"/>
+          <w:vertAlign w:val="superscript"/>
+        </w:rPr>
+        <w:t xml:space="preserve">2</w:t>
+      </w:r>
+      <w:r>
+        <w:rPr>
+          <w:i/>
+          <w:iCs/>
+          <w:sz w:val="36"/>
+          <w:szCs w:val="36"/>
+        </w:rPr>
+        <w:t xml:space="preserve">+1</w:t>
+      </w:r>
+      <w:r>
+        <w:rPr>
+          <w:sz w:val="36"/>
+          <w:szCs w:val="36"/>
+        </w:rPr>
+        <w:t xml:space="preserve">,   if   </w:t>
+      </w:r>
+      <w:r>
+        <w:rPr>
+          <w:i/>
+          <w:iCs/>
+          <w:sz w:val="36"/>
+          <w:szCs w:val="36"/>
+        </w:rPr>
+        <w:t xml:space="preserve">−5&lt; x&lt; 0</w:t>
+      </w:r>
+    </w:p>
+    <w:p>
+      <w:pPr>
+        <w:spacing w:after="200" w:before="40"/>
+        <w:jc w:val="center"/>
+      </w:pPr>
+      <w:r>
+        <w:rPr>
+          <w:i/>
+          <w:iCs/>
+          <w:sz w:val="36"/>
+          <w:szCs w:val="36"/>
+        </w:rPr>
+        <w:t xml:space="preserve">√(x</w:t>
+      </w:r>
+      <w:r>
+        <w:rPr>
+          <w:i/>
+          <w:iCs/>
+          <w:sz w:val="36"/>
+          <w:szCs w:val="36"/>
+          <w:vertAlign w:val="superscript"/>
+        </w:rPr>
+        <w:t xml:space="preserve">2</w:t>
+      </w:r>
+      <w:r>
+        <w:rPr>
+          <w:i/>
+          <w:iCs/>
+          <w:sz w:val="36"/>
+          <w:szCs w:val="36"/>
+        </w:rPr>
+        <w:t xml:space="preserve">+5)</w:t>
+      </w:r>
+      <w:r>
+        <w:rPr>
+          <w:sz w:val="36"/>
+          <w:szCs w:val="36"/>
+        </w:rPr>
+        <w:t xml:space="preserve">,   if   </w:t>
+      </w:r>
+      <w:r>
+        <w:rPr>
+          <w:i/>
+          <w:iCs/>
+          <w:sz w:val="36"/>
+          <w:szCs w:val="36"/>
+        </w:rPr>
+        <w:t xml:space="preserve">0≤ x&lt; 5</w:t>
+      </w:r>
+    </w:p>
+    <w:p>
+      <w:pPr>
+        <w:pStyle w:val="Heading3"/>
+        <w:keepNext/>
+      </w:pPr>
+      <w:r>
+        <w:t xml:space="preserve">Question</w:t>
+      </w:r>
+    </w:p>
+    <w:p>
+      <w:pPr>
+        <w:spacing w:after="120" w:before="80" w:line="300"/>
+      </w:pPr>
+      <w:r>
+        <w:t xml:space="preserve">A student found m(0) = 3(0)² + 1 = 1. What is the mistake, if any?</w:t>
+      </w:r>
+    </w:p>
+    <w:p>
+      <w:pPr>
+        <w:spacing w:after="40" w:before="20"/>
+        <w:ind w:left="360"/>
+      </w:pPr>
+      <w:r>
+        <w:rPr>
+          <w:b/>
+          <w:bCs/>
+        </w:rPr>
+        <w:t xml:space="preserve">A.  </w:t>
+      </w:r>
+      <w:r>
+        <w:t xml:space="preserve">There is no mistake.</w:t>
+      </w:r>
+    </w:p>
+    <w:p>
+      <w:pPr>
+        <w:spacing w:after="40" w:before="20"/>
+        <w:ind w:left="360"/>
+      </w:pPr>
+      <w:r>
+        <w:rPr>
+          <w:b/>
+          <w:bCs/>
+        </w:rPr>
+        <w:t xml:space="preserve">B.  </w:t>
+      </w:r>
+      <w:r>
+        <w:t xml:space="preserve">0 belongs to the piece with 0 ≤ x, so m(0) = √5.</w:t>
+      </w:r>
+    </w:p>
+    <w:p>
+      <w:pPr>
+        <w:spacing w:after="40" w:before="20"/>
+        <w:ind w:left="360"/>
+      </w:pPr>
+      <w:r>
+        <w:rPr>
+          <w:b/>
+          <w:bCs/>
+        </w:rPr>
+        <w:t xml:space="preserve">C.  </w:t>
+      </w:r>
+      <w:r>
+        <w:t xml:space="preserve">m(0) is undefined, since 0 is where the pieces meet.</w:t>
+      </w:r>
+    </w:p>
+    <w:p>
+      <w:pPr>
+        <w:spacing w:after="40" w:before="20"/>
+        <w:ind w:left="360"/>
+      </w:pPr>
+      <w:r>
+        <w:rPr>
+          <w:b/>
+          <w:bCs/>
+        </w:rPr>
+        <w:t xml:space="preserve">D.  </w:t>
+      </w:r>
+      <w:r>
+        <w:t xml:space="preserve">0² is 1, so 3(0)² + 1 is 4.</w:t>
+      </w:r>
+    </w:p>
+    <w:p>
+      <w:pPr>
+        <w:pStyle w:val="Heading3"/>
+        <w:keepNext/>
+      </w:pPr>
+      <w:r>
+        <w:t xml:space="preserve">Answer and reasoning</w:t>
+      </w:r>
+    </w:p>
+    <w:p>
+      <w:pPr>
+        <w:spacing w:after="120" w:before="80" w:line="300"/>
+      </w:pPr>
+      <w:r>
+        <w:rPr>
+          <w:i/>
+          <w:iCs/>
+        </w:rPr>
+        <w:t xml:space="preserve">−5&lt; x&lt;0</w:t>
+      </w:r>
+      <w:r>
+        <w:t xml:space="preserve"> leaves 0 out, and </w:t>
+      </w:r>
+      <w:r>
+        <w:rPr>
+          <w:i/>
+          <w:iCs/>
+        </w:rPr>
+        <w:t xml:space="preserve">0≤ x&lt;5</w:t>
+      </w:r>
+      <w:r>
+        <w:t xml:space="preserve"> includes it, so </w:t>
+      </w:r>
+      <w:r>
+        <w:rPr>
+          <w:i/>
+          <w:iCs/>
+        </w:rPr>
+        <w:t xml:space="preserve">m(0)=√(0</w:t>
+      </w:r>
+      <w:r>
+        <w:rPr>
+          <w:i/>
+          <w:iCs/>
+          <w:vertAlign w:val="superscript"/>
+        </w:rPr>
+        <w:t xml:space="preserve">2</w:t>
+      </w:r>
+      <w:r>
+        <w:rPr>
+          <w:i/>
+          <w:iCs/>
+        </w:rPr>
+        <w:t xml:space="preserve">+5)=√5</w:t>
+      </w:r>
+      <w:r>
+        <w:t xml:space="preserve">. The function is defined at 0, since one piece includes it, and </w:t>
+      </w:r>
+      <w:r>
+        <w:rPr>
+          <w:i/>
+          <w:iCs/>
+        </w:rPr>
+        <w:t xml:space="preserve">0</w:t>
+      </w:r>
+      <w:r>
+        <w:rPr>
+          <w:i/>
+          <w:iCs/>
+          <w:vertAlign w:val="superscript"/>
+        </w:rPr>
+        <w:t xml:space="preserve">2</w:t>
+      </w:r>
+      <w:r>
+        <w:rPr>
+          <w:i/>
+          <w:iCs/>
+        </w:rPr>
+        <w:t xml:space="preserve">=0</w:t>
+      </w:r>
+      <w:r>
+        <w:t xml:space="preserve">, not 1, so </w:t>
+      </w:r>
+      <w:r>
+        <w:rPr>
+          <w:i/>
+          <w:iCs/>
+        </w:rPr>
+        <w:t xml:space="preserve">3(0)</w:t>
+      </w:r>
+      <w:r>
+        <w:rPr>
+          <w:i/>
+          <w:iCs/>
+          <w:vertAlign w:val="superscript"/>
+        </w:rPr>
+        <w:t xml:space="preserve">2</w:t>
+      </w:r>
+      <w:r>
+        <w:rPr>
+          <w:i/>
+          <w:iCs/>
+        </w:rPr>
+        <w:t xml:space="preserve">+1</w:t>
+      </w:r>
+      <w:r>
+        <w:t xml:space="preserve"> really is 1, just from the wrong piece. </w:t>
+      </w:r>
+      <w:r>
+        <w:rPr>
+          <w:b/>
+          <w:bCs/>
+        </w:rPr>
+        <w:t xml:space="preserve">0 belongs to the radical piece: </w:t>
+      </w:r>
+      <w:r>
+        <w:rPr>
+          <w:b/>
+          <w:bCs/>
+          <w:i/>
+          <w:iCs/>
+        </w:rPr>
+        <w:t xml:space="preserve">m(0)=√5</w:t>
+      </w:r>
+      <w:r>
+        <w:rPr>
+          <w:b/>
+          <w:bCs/>
+        </w:rPr>
+        <w:t xml:space="preserve">.</w:t>
+      </w:r>
+    </w:p>
+    <w:p>
+      <w:pPr>
+        <w:pStyle w:val="Heading2"/>
+        <w:pageBreakBefore/>
+      </w:pPr>
+      <w:r>
+        <w:t xml:space="preserve">Example 14: Slip 2</w:t>
+      </w:r>
+    </w:p>
+    <w:p>
+      <w:pPr>
+        <w:spacing w:after="40" w:before="200"/>
+        <w:jc w:val="center"/>
+      </w:pPr>
+      <w:r>
+        <w:rPr>
+          <w:i/>
+          <w:iCs/>
+          <w:sz w:val="40"/>
+          <w:szCs w:val="40"/>
+        </w:rPr>
+        <w:t xml:space="preserve">m(−2)=3(−2)</w:t>
+      </w:r>
+      <w:r>
+        <w:rPr>
+          <w:i/>
+          <w:iCs/>
+          <w:sz w:val="40"/>
+          <w:szCs w:val="40"/>
+          <w:vertAlign w:val="superscript"/>
+        </w:rPr>
+        <w:t xml:space="preserve">2</w:t>
+      </w:r>
+      <w:r>
+        <w:rPr>
+          <w:i/>
+          <w:iCs/>
+          <w:sz w:val="40"/>
+          <w:szCs w:val="40"/>
+        </w:rPr>
+        <w:t xml:space="preserve">+1</w:t>
+      </w:r>
+    </w:p>
+    <w:p>
+      <w:pPr>
+        <w:spacing w:after="40" w:before="40"/>
+        <w:jc w:val="center"/>
+      </w:pPr>
+      <w:r>
+        <w:rPr>
+          <w:i/>
+          <w:iCs/>
+          <w:sz w:val="40"/>
+          <w:szCs w:val="40"/>
+        </w:rPr>
+        <w:t xml:space="preserve">=−12+1</w:t>
+      </w:r>
+    </w:p>
+    <w:p>
+      <w:pPr>
+        <w:spacing w:after="200" w:before="40"/>
+        <w:jc w:val="center"/>
+      </w:pPr>
+      <w:r>
+        <w:rPr>
+          <w:i/>
+          <w:iCs/>
+          <w:sz w:val="40"/>
+          <w:szCs w:val="40"/>
+        </w:rPr>
+        <w:t xml:space="preserve">=−11</w:t>
+      </w:r>
+    </w:p>
+    <w:p>
+      <w:pPr>
+        <w:pStyle w:val="Heading3"/>
+        <w:keepNext/>
+      </w:pPr>
+      <w:r>
+        <w:t xml:space="preserve">Question</w:t>
+      </w:r>
+    </w:p>
+    <w:p>
+      <w:pPr>
+        <w:spacing w:after="120" w:before="80" w:line="300"/>
+      </w:pPr>
+      <w:r>
+        <w:t xml:space="preserve">Using the same m, a student found m(−2) this way. What is the mistake, if any?</w:t>
+      </w:r>
+    </w:p>
+    <w:p>
+      <w:pPr>
+        <w:spacing w:after="40" w:before="20"/>
+        <w:ind w:left="360"/>
+      </w:pPr>
+      <w:r>
+        <w:rPr>
+          <w:b/>
+          <w:bCs/>
+        </w:rPr>
+        <w:t xml:space="preserve">A.  </w:t>
+      </w:r>
+      <w:r>
+        <w:t xml:space="preserve">There is no mistake.</w:t>
+      </w:r>
+    </w:p>
+    <w:p>
+      <w:pPr>
+        <w:spacing w:after="40" w:before="20"/>
+        <w:ind w:left="360"/>
+      </w:pPr>
+      <w:r>
+        <w:rPr>
+          <w:b/>
+          <w:bCs/>
+        </w:rPr>
+        <w:t xml:space="preserve">B.  </w:t>
+      </w:r>
+      <w:r>
+        <w:t xml:space="preserve">−2 belongs to the radical piece, so m(−2) = 3.</w:t>
+      </w:r>
+    </w:p>
+    <w:p>
+      <w:pPr>
+        <w:spacing w:after="40" w:before="20"/>
+        <w:ind w:left="360"/>
+      </w:pPr>
+      <w:r>
+        <w:rPr>
+          <w:b/>
+          <w:bCs/>
+        </w:rPr>
+        <w:t xml:space="preserve">C.  </w:t>
+      </w:r>
+      <w:r>
+        <w:t xml:space="preserve">It should be 3(−2) + 1 = −5, without the square.</w:t>
+      </w:r>
+    </w:p>
+    <w:p>
+      <w:pPr>
+        <w:spacing w:after="40" w:before="20"/>
+        <w:ind w:left="360"/>
+      </w:pPr>
+      <w:r>
+        <w:rPr>
+          <w:b/>
+          <w:bCs/>
+        </w:rPr>
+        <w:t xml:space="preserve">D.  </w:t>
+      </w:r>
+      <w:r>
+        <w:t xml:space="preserve">(−2)² is 4, not −4, so m(−2) = 13.</w:t>
+      </w:r>
+    </w:p>
+    <w:p>
+      <w:pPr>
+        <w:pStyle w:val="Heading3"/>
+        <w:keepNext/>
+      </w:pPr>
+      <w:r>
+        <w:t xml:space="preserve">Answer and reasoning</w:t>
+      </w:r>
+    </w:p>
+    <w:p>
+      <w:pPr>
+        <w:spacing w:after="120" w:before="80" w:line="300"/>
+      </w:pPr>
+      <w:r>
+        <w:t xml:space="preserve">The piece is right, since −2 is between −5 and 0. But </w:t>
+      </w:r>
+      <w:r>
+        <w:rPr>
+          <w:i/>
+          <w:iCs/>
+        </w:rPr>
+        <w:t xml:space="preserve">(−2)</w:t>
+      </w:r>
+      <w:r>
+        <w:rPr>
+          <w:i/>
+          <w:iCs/>
+          <w:vertAlign w:val="superscript"/>
+        </w:rPr>
+        <w:t xml:space="preserve">2</w:t>
+      </w:r>
+      <w:r>
+        <w:rPr>
+          <w:i/>
+          <w:iCs/>
+        </w:rPr>
+        <w:t xml:space="preserve">=(−2)(−2)=4</w:t>
+      </w:r>
+      <w:r>
+        <w:t xml:space="preserve">, so </w:t>
+      </w:r>
+      <w:r>
+        <w:rPr>
+          <w:i/>
+          <w:iCs/>
+        </w:rPr>
+        <w:t xml:space="preserve">m(−2)=3(4)+1=13</w:t>
+      </w:r>
+      <w:r>
+        <w:t xml:space="preserve">. The radical piece starts at 0, and the square is part of the formula; dropping it changes the function. </w:t>
+      </w:r>
+      <w:r>
+        <w:rPr>
+          <w:b/>
+          <w:bCs/>
+          <w:i/>
+          <w:iCs/>
+        </w:rPr>
+        <w:t xml:space="preserve">(−2)</w:t>
+      </w:r>
+      <w:r>
+        <w:rPr>
+          <w:b/>
+          <w:bCs/>
+          <w:i/>
+          <w:iCs/>
+          <w:vertAlign w:val="superscript"/>
+        </w:rPr>
+        <w:t xml:space="preserve">2</w:t>
+      </w:r>
+      <w:r>
+        <w:rPr>
+          <w:b/>
+          <w:bCs/>
+          <w:i/>
+          <w:iCs/>
+        </w:rPr>
+        <w:t xml:space="preserve">=4</w:t>
+      </w:r>
+      <w:r>
+        <w:rPr>
+          <w:b/>
+          <w:bCs/>
+        </w:rPr>
+        <w:t xml:space="preserve">: </w:t>
+      </w:r>
+      <w:r>
+        <w:rPr>
+          <w:b/>
+          <w:bCs/>
+          <w:i/>
+          <w:iCs/>
+        </w:rPr>
+        <w:t xml:space="preserve">m(−2)=13</w:t>
+      </w:r>
+      <w:r>
+        <w:rPr>
+          <w:b/>
+          <w:bCs/>
+        </w:rPr>
+        <w:t xml:space="preserve">.</w:t>
+      </w:r>
+    </w:p>
+    <w:p>
+      <w:pPr>
+        <w:pStyle w:val="Heading2"/>
+        <w:pageBreakBefore/>
+      </w:pPr>
+      <w:r>
+        <w:t xml:space="preserve">Example 15: Slip 3</w:t>
+      </w:r>
+    </w:p>
+    <w:p>
+      <w:pPr>
+        <w:spacing w:after="40" w:before="200"/>
+        <w:jc w:val="center"/>
+      </w:pPr>
+      <w:r>
+        <w:rPr>
+          <w:i/>
+          <w:iCs/>
+          <w:sz w:val="40"/>
+          <w:szCs w:val="40"/>
+        </w:rPr>
+        <w:t xml:space="preserve">p(x)=</w:t>
+      </w:r>
+    </w:p>
+    <w:p>
+      <w:pPr>
+        <w:spacing w:after="40" w:before="40"/>
+        <w:jc w:val="center"/>
+      </w:pPr>
+      <w:r>
+        <w:rPr>
+          <w:i/>
+          <w:iCs/>
+          <w:sz w:val="36"/>
+          <w:szCs w:val="36"/>
+        </w:rPr>
+        <w:t xml:space="preserve">(4x+2)/(2x</w:t>
+      </w:r>
+      <w:r>
+        <w:rPr>
+          <w:i/>
+          <w:iCs/>
+          <w:sz w:val="36"/>
+          <w:szCs w:val="36"/>
+          <w:vertAlign w:val="superscript"/>
+        </w:rPr>
+        <w:t xml:space="preserve">2</w:t>
+      </w:r>
+      <w:r>
+        <w:rPr>
+          <w:i/>
+          <w:iCs/>
+          <w:sz w:val="36"/>
+          <w:szCs w:val="36"/>
+        </w:rPr>
+        <w:t xml:space="preserve">+2)</w:t>
+      </w:r>
+      <w:r>
+        <w:rPr>
+          <w:sz w:val="36"/>
+          <w:szCs w:val="36"/>
+        </w:rPr>
+        <w:t xml:space="preserve">,   if   </w:t>
+      </w:r>
+      <w:r>
+        <w:rPr>
+          <w:i/>
+          <w:iCs/>
+          <w:sz w:val="36"/>
+          <w:szCs w:val="36"/>
+        </w:rPr>
+        <w:t xml:space="preserve">−5&lt; x&lt; −1</w:t>
+      </w:r>
+    </w:p>
+    <w:p>
+      <w:pPr>
+        <w:spacing w:after="200" w:before="40"/>
+        <w:jc w:val="center"/>
+      </w:pPr>
+      <w:r>
+        <w:rPr>
+          <w:i/>
+          <w:iCs/>
+          <w:sz w:val="36"/>
+          <w:szCs w:val="36"/>
+        </w:rPr>
+        <w:t xml:space="preserve">x</w:t>
+      </w:r>
+      <w:r>
+        <w:rPr>
+          <w:i/>
+          <w:iCs/>
+          <w:sz w:val="36"/>
+          <w:szCs w:val="36"/>
+          <w:vertAlign w:val="superscript"/>
+        </w:rPr>
+        <w:t xml:space="preserve">2</w:t>
+      </w:r>
+      <w:r>
+        <w:rPr>
+          <w:i/>
+          <w:iCs/>
+          <w:sz w:val="36"/>
+          <w:szCs w:val="36"/>
+        </w:rPr>
+        <w:t xml:space="preserve">+2x</w:t>
+      </w:r>
+      <w:r>
+        <w:rPr>
+          <w:sz w:val="36"/>
+          <w:szCs w:val="36"/>
+        </w:rPr>
+        <w:t xml:space="preserve">,   if   </w:t>
+      </w:r>
+      <w:r>
+        <w:rPr>
+          <w:i/>
+          <w:iCs/>
+          <w:sz w:val="36"/>
+          <w:szCs w:val="36"/>
+        </w:rPr>
+        <w:t xml:space="preserve">−1≤ x&lt; 5</w:t>
+      </w:r>
+    </w:p>
+    <w:p>
+      <w:pPr>
+        <w:pStyle w:val="Heading3"/>
+        <w:keepNext/>
+      </w:pPr>
+      <w:r>
+        <w:t xml:space="preserve">Question</w:t>
+      </w:r>
+    </w:p>
+    <w:p>
+      <w:pPr>
+        <w:spacing w:after="120" w:before="80" w:line="300"/>
+      </w:pPr>
+      <w:r>
+        <w:t xml:space="preserve">A student found </w:t>
+      </w:r>
+      <w:r>
+        <w:rPr>
+          <w:i/>
+          <w:iCs/>
+        </w:rPr>
+        <w:t xml:space="preserve">p(−2)=(4(−2)+2)/(2(−2)</w:t>
+      </w:r>
+      <w:r>
+        <w:rPr>
+          <w:i/>
+          <w:iCs/>
+          <w:vertAlign w:val="superscript"/>
+        </w:rPr>
+        <w:t xml:space="preserve">2</w:t>
+      </w:r>
+      <w:r>
+        <w:rPr>
+          <w:i/>
+          <w:iCs/>
+        </w:rPr>
+        <w:t xml:space="preserve">+2)=(−6)/10=−3/5</w:t>
+      </w:r>
+      <w:r>
+        <w:t xml:space="preserve">. What is the mistake, if any?</w:t>
+      </w:r>
+    </w:p>
+    <w:p>
+      <w:pPr>
+        <w:spacing w:after="40" w:before="20"/>
+        <w:ind w:left="360"/>
+      </w:pPr>
+      <w:r>
+        <w:rPr>
+          <w:b/>
+          <w:bCs/>
+        </w:rPr>
+        <w:t xml:space="preserve">A.  </w:t>
+      </w:r>
+      <w:r>
+        <w:t xml:space="preserve">There is no mistake.</w:t>
+      </w:r>
+    </w:p>
+    <w:p>
+      <w:pPr>
+        <w:spacing w:after="40" w:before="20"/>
+        <w:ind w:left="360"/>
+      </w:pPr>
+      <w:r>
+        <w:rPr>
+          <w:b/>
+          <w:bCs/>
+        </w:rPr>
+        <w:t xml:space="preserve">B.  </w:t>
+      </w:r>
+      <w:r>
+        <w:t xml:space="preserve">−2 belongs to the other piece, so p(−2) = 0.</w:t>
+      </w:r>
+    </w:p>
+    <w:p>
+      <w:pPr>
+        <w:spacing w:after="40" w:before="20"/>
+        <w:ind w:left="360"/>
+      </w:pPr>
+      <w:r>
+        <w:rPr>
+          <w:b/>
+          <w:bCs/>
+        </w:rPr>
+        <w:t xml:space="preserve">C.  </w:t>
+      </w:r>
+      <w:r>
+        <w:t xml:space="preserve">The bottom should be 2(−4) + 2 = −6, so it is 1.</w:t>
+      </w:r>
+    </w:p>
+    <w:p>
+      <w:pPr>
+        <w:spacing w:after="40" w:before="20"/>
+        <w:ind w:left="360"/>
+      </w:pPr>
+      <w:r>
+        <w:rPr>
+          <w:b/>
+          <w:bCs/>
+        </w:rPr>
+        <w:t xml:space="preserve">D.  </w:t>
+      </w:r>
+      <w:r>
+        <w:t xml:space="preserve">It should stay −6/10, because reducing changes the value.</w:t>
+      </w:r>
+    </w:p>
+    <w:p>
+      <w:pPr>
+        <w:pStyle w:val="Heading3"/>
+        <w:keepNext/>
+      </w:pPr>
+      <w:r>
+        <w:t xml:space="preserve">Answer and reasoning</w:t>
+      </w:r>
+    </w:p>
+    <w:p>
+      <w:pPr>
+        <w:spacing w:after="120" w:before="80" w:line="300"/>
+      </w:pPr>
+      <w:r>
+        <w:t xml:space="preserve">−2 is between −5 and −1, so the fraction piece is the right one. Top: </w:t>
+      </w:r>
+      <w:r>
+        <w:rPr>
+          <w:i/>
+          <w:iCs/>
+        </w:rPr>
+        <w:t xml:space="preserve">4(−2)+2=−6</w:t>
+      </w:r>
+      <w:r>
+        <w:t xml:space="preserve">. Bottom: </w:t>
+      </w:r>
+      <w:r>
+        <w:rPr>
+          <w:i/>
+          <w:iCs/>
+        </w:rPr>
+        <w:t xml:space="preserve">2(−2)</w:t>
+      </w:r>
+      <w:r>
+        <w:rPr>
+          <w:i/>
+          <w:iCs/>
+          <w:vertAlign w:val="superscript"/>
+        </w:rPr>
+        <w:t xml:space="preserve">2</w:t>
+      </w:r>
+      <w:r>
+        <w:rPr>
+          <w:i/>
+          <w:iCs/>
+        </w:rPr>
+        <w:t xml:space="preserve">+2=2(4)+2=10</w:t>
+      </w:r>
+      <w:r>
+        <w:t xml:space="preserve">. So </w:t>
+      </w:r>
+      <w:r>
+        <w:rPr>
+          <w:i/>
+          <w:iCs/>
+        </w:rPr>
+        <w:t xml:space="preserve">p(−2)=−6/10=−3/5</w:t>
+      </w:r>
+      <w:r>
+        <w:t xml:space="preserve">, reduced, as CheckIt wants. The other piece starts at −1; </w:t>
+      </w:r>
+      <w:r>
+        <w:rPr>
+          <w:i/>
+          <w:iCs/>
+        </w:rPr>
+        <w:t xml:space="preserve">(−2)</w:t>
+      </w:r>
+      <w:r>
+        <w:rPr>
+          <w:i/>
+          <w:iCs/>
+          <w:vertAlign w:val="superscript"/>
+        </w:rPr>
+        <w:t xml:space="preserve">2</w:t>
+      </w:r>
+      <w:r>
+        <w:t xml:space="preserve"> is 4, not −4; and reducing a fraction never changes its value. </w:t>
+      </w:r>
+      <w:r>
+        <w:rPr>
+          <w:b/>
+          <w:bCs/>
+        </w:rPr>
+        <w:t xml:space="preserve">There is no mistake.</w:t>
+      </w:r>
+    </w:p>
+    <w:p>
+      <w:pPr>
+        <w:pStyle w:val="Heading2"/>
+        <w:pageBreakBefore/>
+      </w:pPr>
+      <w:r>
+        <w:t xml:space="preserve">Example 16: Slip 4</w:t>
       </w:r>
     </w:p>
     <w:p>
@@ -4326,9 +4237,9 @@
       <w:r>
         <w:drawing>
           <wp:inline distT="0" distB="0" distL="0" distR="0">
-            <wp:extent cx="3286125" cy="2476500"/>
+            <wp:extent cx="2543175" cy="2476500"/>
             <wp:effectExtent t="0" r="0" b="0" l="0"/>
-            <wp:docPr id="1" name="sl5" descr="The graph of g, made of three straight segments. Plotted data: A graph of g on the interval from x = −4 to x = 5, drawn on a grid with lines every 1 unit. It is made of three straight segments: from (−4, 4) down to (−1, −2), then up to (3, 2), then down to (5, 0). The ends and corners are marked with dots." title="The graph of g, made of three straight segments"/>
+            <wp:docPr id="1" name="sl4" descr="The graph of g, made of three straight segments. Plotted data: A graph of g on the interval from x = −3 to x = 3, drawn on a grid with lines every 1 unit. It is made of three straight segments: from (−3, −4) up to (−1, −2), then up more steeply to (1, 2), then down to (3, 0). The ends and corners are marked with dots." title="The graph of g, made of three straight segments"/>
             <wp:cNvGraphicFramePr>
               <a:graphicFrameLocks xmlns:a="http://schemas.openxmlformats.org/drawingml/2006/main" noChangeAspect="1"/>
             </wp:cNvGraphicFramePr>
@@ -4351,6 +4262,311 @@
                   <pic:spPr bwMode="auto">
                     <a:xfrm>
                       <a:off x="0" y="0"/>
+                      <a:ext cx="2543175" cy="2476500"/>
+                    </a:xfrm>
+                    <a:prstGeom prst="rect">
+                      <a:avLst/>
+                    </a:prstGeom>
+                  </pic:spPr>
+                </pic:pic>
+              </a:graphicData>
+            </a:graphic>
+          </wp:inline>
+        </w:drawing>
+      </w:r>
+    </w:p>
+    <w:p>
+      <w:pPr>
+        <w:spacing w:after="120" w:before="80" w:line="300"/>
+      </w:pPr>
+      <w:r>
+        <w:rPr>
+          <w:b/>
+          <w:bCs/>
+          <w:sz w:val="22"/>
+          <w:szCs w:val="22"/>
+        </w:rPr>
+        <w:t xml:space="preserve">Plotted data: </w:t>
+      </w:r>
+      <w:r>
+        <w:rPr>
+          <w:sz w:val="22"/>
+          <w:szCs w:val="22"/>
+        </w:rPr>
+        <w:t xml:space="preserve">A graph of g on the interval from x = −3 to x = 3, drawn on a grid with lines every 1 unit. It is made of three straight segments: from (−3, −4) up to (−1, −2), then up more steeply to (1, 2), then down to (3, 0). The ends and corners are marked with dots.</w:t>
+      </w:r>
+    </w:p>
+    <w:p>
+      <w:pPr>
+        <w:pStyle w:val="Heading3"/>
+        <w:keepNext/>
+      </w:pPr>
+      <w:r>
+        <w:t xml:space="preserve">Question</w:t>
+      </w:r>
+    </w:p>
+    <w:p>
+      <w:pPr>
+        <w:spacing w:after="120" w:before="80" w:line="300"/>
+      </w:pPr>
+      <w:r>
+        <w:t xml:space="preserve">For which x in [−3, 3] does g(x) = 0? A student answered x = 0 only. What is the mistake, if any?</w:t>
+      </w:r>
+    </w:p>
+    <w:p>
+      <w:pPr>
+        <w:spacing w:after="40" w:before="20"/>
+        <w:ind w:left="360"/>
+      </w:pPr>
+      <w:r>
+        <w:rPr>
+          <w:b/>
+          <w:bCs/>
+        </w:rPr>
+        <w:t xml:space="preserve">A.  </w:t>
+      </w:r>
+      <w:r>
+        <w:t xml:space="preserve">There is no mistake.</w:t>
+      </w:r>
+    </w:p>
+    <w:p>
+      <w:pPr>
+        <w:spacing w:after="40" w:before="20"/>
+        <w:ind w:left="360"/>
+      </w:pPr>
+      <w:r>
+        <w:rPr>
+          <w:b/>
+          <w:bCs/>
+        </w:rPr>
+        <w:t xml:space="preserve">B.  </w:t>
+      </w:r>
+      <w:r>
+        <w:t xml:space="preserve">x = 3 counts too: the right end is on the x-axis.</w:t>
+      </w:r>
+    </w:p>
+    <w:p>
+      <w:pPr>
+        <w:spacing w:after="40" w:before="20"/>
+        <w:ind w:left="360"/>
+      </w:pPr>
+      <w:r>
+        <w:rPr>
+          <w:b/>
+          <w:bCs/>
+        </w:rPr>
+        <w:t xml:space="preserve">C.  </w:t>
+      </w:r>
+      <w:r>
+        <w:t xml:space="preserve">The answer should be the output g(0) = 0, not an x-value.</w:t>
+      </w:r>
+    </w:p>
+    <w:p>
+      <w:pPr>
+        <w:spacing w:after="40" w:before="20"/>
+        <w:ind w:left="360"/>
+      </w:pPr>
+      <w:r>
+        <w:rPr>
+          <w:b/>
+          <w:bCs/>
+        </w:rPr>
+        <w:t xml:space="preserve">D.  </w:t>
+      </w:r>
+      <w:r>
+        <w:t xml:space="preserve">x = −1 counts too, since the graph turns there.</w:t>
+      </w:r>
+    </w:p>
+    <w:p>
+      <w:pPr>
+        <w:pStyle w:val="Heading3"/>
+        <w:keepNext/>
+      </w:pPr>
+      <w:r>
+        <w:t xml:space="preserve">Answer and reasoning</w:t>
+      </w:r>
+    </w:p>
+    <w:p>
+      <w:pPr>
+        <w:spacing w:after="120" w:before="80" w:line="300"/>
+      </w:pPr>
+      <w:r>
+        <w:t xml:space="preserve">The line </w:t>
+      </w:r>
+      <w:r>
+        <w:rPr>
+          <w:i/>
+          <w:iCs/>
+        </w:rPr>
+        <w:t xml:space="preserve">y=0</w:t>
+      </w:r>
+      <w:r>
+        <w:t xml:space="preserve"> is the </w:t>
+      </w:r>
+      <w:r>
+        <w:rPr>
+          <w:i/>
+          <w:iCs/>
+        </w:rPr>
+        <w:t xml:space="preserve">x</w:t>
+      </w:r>
+      <w:r>
+        <w:t xml:space="preserve">-axis. The steep segment from </w:t>
+      </w:r>
+      <w:r>
+        <w:rPr>
+          <w:i/>
+          <w:iCs/>
+        </w:rPr>
+        <w:t xml:space="preserve">(−1,−2)</w:t>
+      </w:r>
+      <w:r>
+        <w:t xml:space="preserve"> to </w:t>
+      </w:r>
+      <w:r>
+        <w:rPr>
+          <w:i/>
+          <w:iCs/>
+        </w:rPr>
+        <w:t xml:space="preserve">(1,2)</w:t>
+      </w:r>
+      <w:r>
+        <w:t xml:space="preserve"> crosses it at </w:t>
+      </w:r>
+      <w:r>
+        <w:rPr>
+          <w:i/>
+          <w:iCs/>
+        </w:rPr>
+        <w:t xml:space="preserve">x=0</w:t>
+      </w:r>
+      <w:r>
+        <w:t xml:space="preserve">, and the graph ends on it at </w:t>
+      </w:r>
+      <w:r>
+        <w:rPr>
+          <w:i/>
+          <w:iCs/>
+        </w:rPr>
+        <w:t xml:space="preserve">(3,0)</w:t>
+      </w:r>
+      <w:r>
+        <w:t xml:space="preserve">. The end is a point of the graph, and 3 is in the interval, so </w:t>
+      </w:r>
+      <w:r>
+        <w:rPr>
+          <w:i/>
+          <w:iCs/>
+        </w:rPr>
+        <w:t xml:space="preserve">x=0</w:t>
+      </w:r>
+      <w:r>
+        <w:t xml:space="preserve"> and </w:t>
+      </w:r>
+      <w:r>
+        <w:rPr>
+          <w:i/>
+          <w:iCs/>
+        </w:rPr>
+        <w:t xml:space="preserve">x=3</w:t>
+      </w:r>
+      <w:r>
+        <w:t xml:space="preserve">. The question asks for inputs, so the answer is </w:t>
+      </w:r>
+      <w:r>
+        <w:rPr>
+          <w:i/>
+          <w:iCs/>
+        </w:rPr>
+        <w:t xml:space="preserve">x</w:t>
+      </w:r>
+      <w:r>
+        <w:t xml:space="preserve">-values; and at </w:t>
+      </w:r>
+      <w:r>
+        <w:rPr>
+          <w:i/>
+          <w:iCs/>
+        </w:rPr>
+        <w:t xml:space="preserve">x=−1</w:t>
+      </w:r>
+      <w:r>
+        <w:t xml:space="preserve"> the graph is at height −2, where it gets steeper but does not turn around. </w:t>
+      </w:r>
+      <w:r>
+        <w:rPr>
+          <w:b/>
+          <w:bCs/>
+          <w:i/>
+          <w:iCs/>
+        </w:rPr>
+        <w:t xml:space="preserve">x=0</w:t>
+      </w:r>
+      <w:r>
+        <w:rPr>
+          <w:b/>
+          <w:bCs/>
+        </w:rPr>
+        <w:t xml:space="preserve"> and </w:t>
+      </w:r>
+      <w:r>
+        <w:rPr>
+          <w:b/>
+          <w:bCs/>
+          <w:i/>
+          <w:iCs/>
+        </w:rPr>
+        <w:t xml:space="preserve">x=3</w:t>
+      </w:r>
+      <w:r>
+        <w:rPr>
+          <w:b/>
+          <w:bCs/>
+        </w:rPr>
+        <w:t xml:space="preserve">.</w:t>
+      </w:r>
+    </w:p>
+    <w:p>
+      <w:pPr>
+        <w:pStyle w:val="Heading2"/>
+        <w:pageBreakBefore/>
+      </w:pPr>
+      <w:r>
+        <w:t xml:space="preserve">Example 17: Slip 5</w:t>
+      </w:r>
+    </w:p>
+    <w:p>
+      <w:pPr>
+        <w:spacing w:after="60" w:before="60"/>
+      </w:pPr>
+      <w:r>
+        <w:drawing>
+          <wp:inline distT="0" distB="0" distL="0" distR="0">
+            <wp:extent cx="3286125" cy="2476500"/>
+            <wp:effectExtent t="0" r="0" b="0" l="0"/>
+            <wp:docPr id="1" name="sl5" descr="The graph of g, made of three straight segments. Plotted data: A graph of g on the interval from x = −4 to x = 5, drawn on a grid with lines every 1 unit. It is made of three straight segments: from (−4, 4) down to (−1, −2), then up to (3, 2), then down to (5, 0). The ends and corners are marked with dots." title="The graph of g, made of three straight segments"/>
+            <wp:cNvGraphicFramePr>
+              <a:graphicFrameLocks xmlns:a="http://schemas.openxmlformats.org/drawingml/2006/main" noChangeAspect="1"/>
+            </wp:cNvGraphicFramePr>
+            <a:graphic xmlns:a="http://schemas.openxmlformats.org/drawingml/2006/main">
+              <a:graphicData uri="http://schemas.openxmlformats.org/drawingml/2006/picture">
+                <pic:pic xmlns:pic="http://schemas.openxmlformats.org/drawingml/2006/picture">
+                  <pic:nvPicPr>
+                    <pic:cNvPr id="0" name="" descr=""/>
+                    <pic:cNvPicPr>
+                      <a:picLocks noChangeAspect="1" noChangeArrowheads="1"/>
+                    </pic:cNvPicPr>
+                  </pic:nvPicPr>
+                  <pic:blipFill>
+                    <a:blip r:embed="rId15" cstate="none"/>
+                    <a:srcRect/>
+                    <a:stretch>
+                      <a:fillRect/>
+                    </a:stretch>
+                  </pic:blipFill>
+                  <pic:spPr bwMode="auto">
+                    <a:xfrm>
+                      <a:off x="0" y="0"/>
                       <a:ext cx="3286125" cy="2476500"/>
                     </a:xfrm>
                     <a:prstGeom prst="rect">
@@ -4399,7 +4615,7 @@
         <w:spacing w:after="120" w:before="80" w:line="300"/>
       </w:pPr>
       <w:r>
-        <w:t xml:space="preserve">A student was asked for g(2) and answered 3, because the graph reaches height 2 at x = 3. What is the mistake, if any?</w:t>
+        <w:t xml:space="preserve">A student was asked for g(4) and answered −4, because the graph is at height 4 when x = −4. What is the mistake, if any?</w:t>
       </w:r>
     </w:p>
     <w:p>
@@ -4431,7 +4647,7 @@
         <w:t xml:space="preserve">B.  </w:t>
       </w:r>
       <w:r>
-        <w:t xml:space="preserve">g(2) is −2, the lowest point on the graph.</w:t>
+        <w:t xml:space="preserve">g(4) is 0, since the graph ends on the x-axis at the right end.</w:t>
       </w:r>
     </w:p>
     <w:p>
@@ -4447,7 +4663,7 @@
         <w:t xml:space="preserve">C.  </w:t>
       </w:r>
       <w:r>
-        <w:t xml:space="preserve">The graph also reaches 2 at x = −3, so the answer is −3 and 3.</w:t>
+        <w:t xml:space="preserve">Only the sign is off: the height is 4, so g(4) = 4.</w:t>
       </w:r>
     </w:p>
     <w:p>
@@ -4463,7 +4679,7 @@
         <w:t xml:space="preserve">D.  </w:t>
       </w:r>
       <w:r>
-        <w:t xml:space="preserve">That solves g(x) = 2; g(2) is the height at x = 2, which is 1.</w:t>
+        <w:t xml:space="preserve">That solves g(x) = 4. At x = 4, the height is 1.</w:t>
       </w:r>
     </w:p>
     <w:p>
@@ -4484,27 +4700,27 @@
           <w:i/>
           <w:iCs/>
         </w:rPr>
-        <w:t xml:space="preserve">g(2)</w:t>
-      </w:r>
-      <w:r>
-        <w:t xml:space="preserve"> gives the input 2 and asks for the output: go to </w:t>
-      </w:r>
-      <w:r>
-        <w:rPr>
-          <w:i/>
-          <w:iCs/>
-        </w:rPr>
-        <w:t xml:space="preserve">x=2</w:t>
-      </w:r>
-      <w:r>
-        <w:t xml:space="preserve"> and read the height. The rising segment from </w:t>
-      </w:r>
-      <w:r>
-        <w:rPr>
-          <w:i/>
-          <w:iCs/>
-        </w:rPr>
-        <w:t xml:space="preserve">(−1,−2)</w:t>
+        <w:t xml:space="preserve">g(4)</w:t>
+      </w:r>
+      <w:r>
+        <w:t xml:space="preserve"> gives the input 4 and asks for the output: go to </w:t>
+      </w:r>
+      <w:r>
+        <w:rPr>
+          <w:i/>
+          <w:iCs/>
+        </w:rPr>
+        <w:t xml:space="preserve">x=4</w:t>
+      </w:r>
+      <w:r>
+        <w:t xml:space="preserve"> and read the height. The segment from </w:t>
+      </w:r>
+      <w:r>
+        <w:rPr>
+          <w:i/>
+          <w:iCs/>
+        </w:rPr>
+        <w:t xml:space="preserve">(3,2)</w:t>
       </w:r>
       <w:r>
         <w:t xml:space="preserve"> to </w:t>
@@ -4514,17 +4730,17 @@
           <w:i/>
           <w:iCs/>
         </w:rPr>
-        <w:t xml:space="preserve">(3,2)</w:t>
-      </w:r>
-      <w:r>
-        <w:t xml:space="preserve"> climbs 1 per step, so at </w:t>
-      </w:r>
-      <w:r>
-        <w:rPr>
-          <w:i/>
-          <w:iCs/>
-        </w:rPr>
-        <w:t xml:space="preserve">x=2</w:t>
+        <w:t xml:space="preserve">(5,0)</w:t>
+      </w:r>
+      <w:r>
+        <w:t xml:space="preserve"> drops 1 per step, so at </w:t>
+      </w:r>
+      <w:r>
+        <w:rPr>
+          <w:i/>
+          <w:iCs/>
+        </w:rPr>
+        <w:t xml:space="preserve">x=4</w:t>
       </w:r>
       <w:r>
         <w:t xml:space="preserve"> it is at 1. The student answered the reverse question, </w:t>
@@ -4534,39 +4750,39 @@
           <w:i/>
           <w:iCs/>
         </w:rPr>
-        <w:t xml:space="preserve">g(x)=2</w:t>
-      </w:r>
-      <w:r>
-        <w:t xml:space="preserve">. −2 is the lowest output, at </w:t>
-      </w:r>
-      <w:r>
-        <w:rPr>
-          <w:i/>
-          <w:iCs/>
-        </w:rPr>
-        <w:t xml:space="preserve">x=−1</w:t>
-      </w:r>
-      <w:r>
-        <w:t xml:space="preserve">, and "−3 and 3" is the full answer to </w:t>
-      </w:r>
-      <w:r>
-        <w:rPr>
-          <w:i/>
-          <w:iCs/>
-        </w:rPr>
-        <w:t xml:space="preserve">g(x)=2</w:t>
-      </w:r>
-      <w:r>
-        <w:t xml:space="preserve">, still the reverse question. </w:t>
-      </w:r>
-      <w:r>
-        <w:rPr>
-          <w:b/>
-          <w:bCs/>
-          <w:i/>
-          <w:iCs/>
-        </w:rPr>
-        <w:t xml:space="preserve">g(2)=1</w:t>
+        <w:t xml:space="preserve">g(x)=4</w:t>
+      </w:r>
+      <w:r>
+        <w:t xml:space="preserve">. 0 is the height at the right end, </w:t>
+      </w:r>
+      <w:r>
+        <w:rPr>
+          <w:i/>
+          <w:iCs/>
+        </w:rPr>
+        <w:t xml:space="preserve">x=5</w:t>
+      </w:r>
+      <w:r>
+        <w:t xml:space="preserve">, not at </w:t>
+      </w:r>
+      <w:r>
+        <w:rPr>
+          <w:i/>
+          <w:iCs/>
+        </w:rPr>
+        <w:t xml:space="preserve">x=4</w:t>
+      </w:r>
+      <w:r>
+        <w:t xml:space="preserve">; and 4 is the output the student matched, not the output at input 4. </w:t>
+      </w:r>
+      <w:r>
+        <w:rPr>
+          <w:b/>
+          <w:bCs/>
+          <w:i/>
+          <w:iCs/>
+        </w:rPr>
+        <w:t xml:space="preserve">g(4)=1</w:t>
       </w:r>
       <w:r>
         <w:rPr>

</xml_diff>